<commit_message>
Revert "КП Final pdf"
This reverts commit 042d52e1c6d847fb797760dfd8945db455f3e0d9.
</commit_message>
<xml_diff>
--- a/zFILES/ПРИМЕР КП 2023 для П3А/2.Содержание.docx
+++ b/zFILES/ПРИМЕР КП 2023 для П3А/2.Содержание.docx
@@ -639,41 +639,13 @@
                               <w:lang w:val="en-GB"/>
                             </w:rPr>
                           </w:pPr>
-                          <w:proofErr w:type="spellStart"/>
                           <w:r>
                             <w:rPr>
                               <w:sz w:val="24"/>
                               <w:szCs w:val="24"/>
                               <w:lang w:val="en-GB"/>
                             </w:rPr>
-                            <w:t>Secondhand</w:t>
-                          </w:r>
-                          <w:proofErr w:type="spellEnd"/>
-                          <w:r>
-                            <w:rPr>
-                              <w:sz w:val="24"/>
-                              <w:szCs w:val="24"/>
-                              <w:lang w:val="en-GB"/>
-                            </w:rPr>
-                            <w:t xml:space="preserve"> Book Marketplace “</w:t>
-                          </w:r>
-                          <w:proofErr w:type="spellStart"/>
-                          <w:r>
-                            <w:rPr>
-                              <w:sz w:val="24"/>
-                              <w:szCs w:val="24"/>
-                              <w:lang w:val="en-GB"/>
-                            </w:rPr>
-                            <w:t>ReRead</w:t>
-                          </w:r>
-                          <w:proofErr w:type="spellEnd"/>
-                          <w:r>
-                            <w:rPr>
-                              <w:sz w:val="24"/>
-                              <w:szCs w:val="24"/>
-                              <w:lang w:val="en-GB"/>
-                            </w:rPr>
-                            <w:t>”</w:t>
+                            <w:t>Secondhand Book Marketplace “ReRead”</w:t>
                           </w:r>
                         </w:p>
                       </w:tc>
@@ -1451,16 +1423,13 @@
         <w:tblLook w:val="04A0" w:firstRow="1" w:lastRow="0" w:firstColumn="1" w:lastColumn="0" w:noHBand="0" w:noVBand="1"/>
       </w:tblPr>
       <w:tblGrid>
-        <w:gridCol w:w="9503"/>
-        <w:gridCol w:w="634"/>
+        <w:gridCol w:w="9464"/>
+        <w:gridCol w:w="531"/>
       </w:tblGrid>
       <w:tr>
-        <w:trPr>
-          <w:trHeight w:val="264"/>
-        </w:trPr>
-        <w:tc>
-          <w:tcPr>
-            <w:tcW w:w="9503" w:type="dxa"/>
+        <w:tc>
+          <w:tcPr>
+            <w:tcW w:w="9464" w:type="dxa"/>
           </w:tcPr>
           <w:p>
             <w:pPr>
@@ -1480,7 +1449,7 @@
         </w:tc>
         <w:tc>
           <w:tcPr>
-            <w:tcW w:w="634" w:type="dxa"/>
+            <w:tcW w:w="531" w:type="dxa"/>
           </w:tcPr>
           <w:p>
             <w:pPr>
@@ -1500,12 +1469,9 @@
         </w:tc>
       </w:tr>
       <w:tr>
-        <w:trPr>
-          <w:trHeight w:val="277"/>
-        </w:trPr>
-        <w:tc>
-          <w:tcPr>
-            <w:tcW w:w="9503" w:type="dxa"/>
+        <w:tc>
+          <w:tcPr>
+            <w:tcW w:w="9464" w:type="dxa"/>
           </w:tcPr>
           <w:p>
             <w:pPr>
@@ -1526,7 +1492,7 @@
         </w:tc>
         <w:tc>
           <w:tcPr>
-            <w:tcW w:w="634" w:type="dxa"/>
+            <w:tcW w:w="531" w:type="dxa"/>
           </w:tcPr>
           <w:p>
             <w:pPr>
@@ -1546,12 +1512,9 @@
         </w:tc>
       </w:tr>
       <w:tr>
-        <w:trPr>
-          <w:trHeight w:val="264"/>
-        </w:trPr>
-        <w:tc>
-          <w:tcPr>
-            <w:tcW w:w="9503" w:type="dxa"/>
+        <w:tc>
+          <w:tcPr>
+            <w:tcW w:w="9464" w:type="dxa"/>
           </w:tcPr>
           <w:p>
             <w:pPr>
@@ -1573,7 +1536,7 @@
         </w:tc>
         <w:tc>
           <w:tcPr>
-            <w:tcW w:w="634" w:type="dxa"/>
+            <w:tcW w:w="531" w:type="dxa"/>
           </w:tcPr>
           <w:p>
             <w:pPr>
@@ -1593,12 +1556,9 @@
         </w:tc>
       </w:tr>
       <w:tr>
-        <w:trPr>
-          <w:trHeight w:val="277"/>
-        </w:trPr>
-        <w:tc>
-          <w:tcPr>
-            <w:tcW w:w="9503" w:type="dxa"/>
+        <w:tc>
+          <w:tcPr>
+            <w:tcW w:w="9464" w:type="dxa"/>
           </w:tcPr>
           <w:p>
             <w:pPr>
@@ -1623,12 +1583,6 @@
             <w:r>
               <w:rPr>
                 <w:sz w:val="28"/>
-              </w:rPr>
-              <w:t xml:space="preserve"> </w:t>
-            </w:r>
-            <w:r>
-              <w:rPr>
-                <w:sz w:val="28"/>
                 <w:szCs w:val="28"/>
               </w:rPr>
               <w:t>Описание языка программирования</w:t>
@@ -1637,7 +1591,7 @@
         </w:tc>
         <w:tc>
           <w:tcPr>
-            <w:tcW w:w="634" w:type="dxa"/>
+            <w:tcW w:w="531" w:type="dxa"/>
           </w:tcPr>
           <w:p>
             <w:pPr>
@@ -1663,12 +1617,9 @@
         </w:tc>
       </w:tr>
       <w:tr>
-        <w:trPr>
-          <w:trHeight w:val="264"/>
-        </w:trPr>
-        <w:tc>
-          <w:tcPr>
-            <w:tcW w:w="9503" w:type="dxa"/>
+        <w:tc>
+          <w:tcPr>
+            <w:tcW w:w="9464" w:type="dxa"/>
           </w:tcPr>
           <w:p>
             <w:pPr>
@@ -1707,7 +1658,7 @@
         </w:tc>
         <w:tc>
           <w:tcPr>
-            <w:tcW w:w="634" w:type="dxa"/>
+            <w:tcW w:w="531" w:type="dxa"/>
           </w:tcPr>
           <w:p>
             <w:pPr>
@@ -1733,12 +1684,9 @@
         </w:tc>
       </w:tr>
       <w:tr>
-        <w:trPr>
-          <w:trHeight w:val="277"/>
-        </w:trPr>
-        <w:tc>
-          <w:tcPr>
-            <w:tcW w:w="9503" w:type="dxa"/>
+        <w:tc>
+          <w:tcPr>
+            <w:tcW w:w="9464" w:type="dxa"/>
           </w:tcPr>
           <w:p>
             <w:pPr>
@@ -1784,7 +1732,7 @@
         </w:tc>
         <w:tc>
           <w:tcPr>
-            <w:tcW w:w="634" w:type="dxa"/>
+            <w:tcW w:w="531" w:type="dxa"/>
           </w:tcPr>
           <w:p>
             <w:pPr>
@@ -1792,7 +1740,6 @@
               <w:jc w:val="right"/>
               <w:rPr>
                 <w:sz w:val="28"/>
-                <w:lang w:val="en-US"/>
               </w:rPr>
             </w:pPr>
             <w:r>
@@ -1804,20 +1751,16 @@
             <w:r>
               <w:rPr>
                 <w:sz w:val="28"/>
-                <w:lang w:val="en-US"/>
-              </w:rPr>
-              <w:t>2</w:t>
+              </w:rPr>
+              <w:t>3</w:t>
             </w:r>
           </w:p>
         </w:tc>
       </w:tr>
       <w:tr>
-        <w:trPr>
-          <w:trHeight w:val="264"/>
-        </w:trPr>
-        <w:tc>
-          <w:tcPr>
-            <w:tcW w:w="9503" w:type="dxa"/>
+        <w:tc>
+          <w:tcPr>
+            <w:tcW w:w="9464" w:type="dxa"/>
           </w:tcPr>
           <w:p>
             <w:pPr>
@@ -1857,7 +1800,7 @@
         </w:tc>
         <w:tc>
           <w:tcPr>
-            <w:tcW w:w="634" w:type="dxa"/>
+            <w:tcW w:w="531" w:type="dxa"/>
           </w:tcPr>
           <w:p>
             <w:pPr>
@@ -1865,32 +1808,21 @@
               <w:jc w:val="right"/>
               <w:rPr>
                 <w:sz w:val="28"/>
-                <w:lang w:val="en-US"/>
-              </w:rPr>
-            </w:pPr>
-            <w:r>
-              <w:rPr>
-                <w:sz w:val="28"/>
-              </w:rPr>
-              <w:t>1</w:t>
-            </w:r>
-            <w:r>
-              <w:rPr>
-                <w:sz w:val="28"/>
-                <w:lang w:val="en-US"/>
-              </w:rPr>
-              <w:t>2</w:t>
+              </w:rPr>
+            </w:pPr>
+            <w:r>
+              <w:rPr>
+                <w:sz w:val="28"/>
+              </w:rPr>
+              <w:t>15</w:t>
             </w:r>
           </w:p>
         </w:tc>
       </w:tr>
       <w:tr>
-        <w:trPr>
-          <w:trHeight w:val="277"/>
-        </w:trPr>
-        <w:tc>
-          <w:tcPr>
-            <w:tcW w:w="9503" w:type="dxa"/>
+        <w:tc>
+          <w:tcPr>
+            <w:tcW w:w="9464" w:type="dxa"/>
           </w:tcPr>
           <w:p>
             <w:pPr>
@@ -1922,7 +1854,7 @@
         </w:tc>
         <w:tc>
           <w:tcPr>
-            <w:tcW w:w="634" w:type="dxa"/>
+            <w:tcW w:w="531" w:type="dxa"/>
           </w:tcPr>
           <w:p>
             <w:pPr>
@@ -1930,26 +1862,21 @@
               <w:jc w:val="right"/>
               <w:rPr>
                 <w:sz w:val="28"/>
-                <w:lang w:val="en-US"/>
-              </w:rPr>
-            </w:pPr>
-            <w:r>
-              <w:rPr>
-                <w:sz w:val="28"/>
-                <w:lang w:val="en-US"/>
-              </w:rPr>
-              <w:t>13</w:t>
+              </w:rPr>
+            </w:pPr>
+            <w:r>
+              <w:rPr>
+                <w:sz w:val="28"/>
+              </w:rPr>
+              <w:t>17</w:t>
             </w:r>
           </w:p>
         </w:tc>
       </w:tr>
       <w:tr>
-        <w:trPr>
-          <w:trHeight w:val="264"/>
-        </w:trPr>
-        <w:tc>
-          <w:tcPr>
-            <w:tcW w:w="9503" w:type="dxa"/>
+        <w:tc>
+          <w:tcPr>
+            <w:tcW w:w="9464" w:type="dxa"/>
           </w:tcPr>
           <w:p>
             <w:pPr>
@@ -1988,7 +1915,7 @@
         </w:tc>
         <w:tc>
           <w:tcPr>
-            <w:tcW w:w="634" w:type="dxa"/>
+            <w:tcW w:w="531" w:type="dxa"/>
           </w:tcPr>
           <w:p>
             <w:pPr>
@@ -1996,26 +1923,21 @@
               <w:jc w:val="right"/>
               <w:rPr>
                 <w:sz w:val="28"/>
-                <w:lang w:val="en-US"/>
-              </w:rPr>
-            </w:pPr>
-            <w:r>
-              <w:rPr>
-                <w:sz w:val="28"/>
-                <w:lang w:val="en-US"/>
-              </w:rPr>
-              <w:t>13</w:t>
+              </w:rPr>
+            </w:pPr>
+            <w:r>
+              <w:rPr>
+                <w:sz w:val="28"/>
+              </w:rPr>
+              <w:t>19</w:t>
             </w:r>
           </w:p>
         </w:tc>
       </w:tr>
       <w:tr>
-        <w:trPr>
-          <w:trHeight w:val="277"/>
-        </w:trPr>
-        <w:tc>
-          <w:tcPr>
-            <w:tcW w:w="9503" w:type="dxa"/>
+        <w:tc>
+          <w:tcPr>
+            <w:tcW w:w="9464" w:type="dxa"/>
           </w:tcPr>
           <w:p>
             <w:pPr>
@@ -2026,20 +1948,32 @@
               <w:rPr>
                 <w:sz w:val="28"/>
               </w:rPr>
-              <w:t xml:space="preserve">2 </w:t>
-            </w:r>
-            <w:r>
-              <w:rPr>
-                <w:sz w:val="28"/>
-                <w:szCs w:val="28"/>
-              </w:rPr>
-              <w:t>СПЕЦИАЛЬНАЯ ЧАСТЬ</w:t>
-            </w:r>
-          </w:p>
-        </w:tc>
-        <w:tc>
-          <w:tcPr>
-            <w:tcW w:w="634" w:type="dxa"/>
+              <w:t>1.</w:t>
+            </w:r>
+            <w:r>
+              <w:rPr>
+                <w:sz w:val="28"/>
+              </w:rPr>
+              <w:t>2</w:t>
+            </w:r>
+            <w:r>
+              <w:rPr>
+                <w:sz w:val="28"/>
+              </w:rPr>
+              <w:t xml:space="preserve">.2.4 </w:t>
+            </w:r>
+            <w:r>
+              <w:rPr>
+                <w:sz w:val="28"/>
+                <w:szCs w:val="28"/>
+              </w:rPr>
+              <w:t>Использование вспомогательных алгоритмов</w:t>
+            </w:r>
+          </w:p>
+        </w:tc>
+        <w:tc>
+          <w:tcPr>
+            <w:tcW w:w="531" w:type="dxa"/>
           </w:tcPr>
           <w:p>
             <w:pPr>
@@ -2052,20 +1986,16 @@
             <w:r>
               <w:rPr>
                 <w:sz w:val="28"/>
-                <w:lang w:val="en-US"/>
-              </w:rPr>
-              <w:t>14</w:t>
+              </w:rPr>
+              <w:t>21</w:t>
             </w:r>
           </w:p>
         </w:tc>
       </w:tr>
       <w:tr>
-        <w:trPr>
-          <w:trHeight w:val="264"/>
-        </w:trPr>
-        <w:tc>
-          <w:tcPr>
-            <w:tcW w:w="9503" w:type="dxa"/>
+        <w:tc>
+          <w:tcPr>
+            <w:tcW w:w="9464" w:type="dxa"/>
           </w:tcPr>
           <w:p>
             <w:pPr>
@@ -2081,13 +2011,34 @@
               <w:rPr>
                 <w:sz w:val="28"/>
               </w:rPr>
-              <w:t>2.1 Общая постановка задачи</w:t>
-            </w:r>
-          </w:p>
-        </w:tc>
-        <w:tc>
-          <w:tcPr>
-            <w:tcW w:w="634" w:type="dxa"/>
+              <w:t>1.</w:t>
+            </w:r>
+            <w:r>
+              <w:rPr>
+                <w:sz w:val="28"/>
+              </w:rPr>
+              <w:t>2</w:t>
+            </w:r>
+            <w:r>
+              <w:rPr>
+                <w:sz w:val="28"/>
+              </w:rPr>
+              <w:t xml:space="preserve">.3 </w:t>
+            </w:r>
+            <w:r>
+              <w:rPr>
+                <w:bCs/>
+                <w:sz w:val="28"/>
+                <w:szCs w:val="28"/>
+                <w:lang w:val="en-US"/>
+              </w:rPr>
+              <w:t>Access</w:t>
+            </w:r>
+          </w:p>
+        </w:tc>
+        <w:tc>
+          <w:tcPr>
+            <w:tcW w:w="531" w:type="dxa"/>
           </w:tcPr>
           <w:p>
             <w:pPr>
@@ -2095,26 +2046,21 @@
               <w:jc w:val="right"/>
               <w:rPr>
                 <w:sz w:val="28"/>
-                <w:lang w:val="en-US"/>
-              </w:rPr>
-            </w:pPr>
-            <w:r>
-              <w:rPr>
-                <w:sz w:val="28"/>
-                <w:lang w:val="en-US"/>
-              </w:rPr>
-              <w:t>14</w:t>
+              </w:rPr>
+            </w:pPr>
+            <w:r>
+              <w:rPr>
+                <w:sz w:val="28"/>
+              </w:rPr>
+              <w:t>23</w:t>
             </w:r>
           </w:p>
         </w:tc>
       </w:tr>
       <w:tr>
-        <w:trPr>
-          <w:trHeight w:val="277"/>
-        </w:trPr>
-        <w:tc>
-          <w:tcPr>
-            <w:tcW w:w="9503" w:type="dxa"/>
+        <w:tc>
+          <w:tcPr>
+            <w:tcW w:w="9464" w:type="dxa"/>
           </w:tcPr>
           <w:p>
             <w:pPr>
@@ -2127,15 +2073,34 @@
             <w:r>
               <w:rPr>
                 <w:sz w:val="28"/>
-                <w:szCs w:val="28"/>
-              </w:rPr>
-              <w:t>2.1.1 Описание входных данных и выходных данных</w:t>
-            </w:r>
-          </w:p>
-        </w:tc>
-        <w:tc>
-          <w:tcPr>
-            <w:tcW w:w="634" w:type="dxa"/>
+              </w:rPr>
+              <w:t>1.</w:t>
+            </w:r>
+            <w:r>
+              <w:rPr>
+                <w:sz w:val="28"/>
+              </w:rPr>
+              <w:t>2</w:t>
+            </w:r>
+            <w:r>
+              <w:rPr>
+                <w:sz w:val="28"/>
+              </w:rPr>
+              <w:t xml:space="preserve">.4 </w:t>
+            </w:r>
+            <w:r>
+              <w:rPr>
+                <w:sz w:val="28"/>
+                <w:szCs w:val="28"/>
+                <w:lang w:eastAsia="ko-KR"/>
+              </w:rPr>
+              <w:t>Средства обмена данными</w:t>
+            </w:r>
+          </w:p>
+        </w:tc>
+        <w:tc>
+          <w:tcPr>
+            <w:tcW w:w="531" w:type="dxa"/>
           </w:tcPr>
           <w:p>
             <w:pPr>
@@ -2143,26 +2108,21 @@
               <w:jc w:val="right"/>
               <w:rPr>
                 <w:sz w:val="28"/>
-                <w:lang w:val="en-US"/>
-              </w:rPr>
-            </w:pPr>
-            <w:r>
-              <w:rPr>
-                <w:sz w:val="28"/>
-                <w:lang w:val="en-US"/>
-              </w:rPr>
-              <w:t>15</w:t>
+              </w:rPr>
+            </w:pPr>
+            <w:r>
+              <w:rPr>
+                <w:sz w:val="28"/>
+              </w:rPr>
+              <w:t>26</w:t>
             </w:r>
           </w:p>
         </w:tc>
       </w:tr>
       <w:tr>
-        <w:trPr>
-          <w:trHeight w:val="264"/>
-        </w:trPr>
-        <w:tc>
-          <w:tcPr>
-            <w:tcW w:w="9503" w:type="dxa"/>
+        <w:tc>
+          <w:tcPr>
+            <w:tcW w:w="9464" w:type="dxa"/>
           </w:tcPr>
           <w:p>
             <w:pPr>
@@ -2175,15 +2135,33 @@
             <w:r>
               <w:rPr>
                 <w:sz w:val="28"/>
-                <w:szCs w:val="28"/>
-              </w:rPr>
-              <w:t>2.1.2 Схема работы комплекса</w:t>
-            </w:r>
-          </w:p>
-        </w:tc>
-        <w:tc>
-          <w:tcPr>
-            <w:tcW w:w="634" w:type="dxa"/>
+              </w:rPr>
+              <w:t>1.</w:t>
+            </w:r>
+            <w:r>
+              <w:rPr>
+                <w:sz w:val="28"/>
+              </w:rPr>
+              <w:t>2</w:t>
+            </w:r>
+            <w:r>
+              <w:rPr>
+                <w:sz w:val="28"/>
+              </w:rPr>
+              <w:t xml:space="preserve">.5 </w:t>
+            </w:r>
+            <w:r>
+              <w:rPr>
+                <w:sz w:val="28"/>
+                <w:szCs w:val="28"/>
+              </w:rPr>
+              <w:t>Встроенные языки</w:t>
+            </w:r>
+          </w:p>
+        </w:tc>
+        <w:tc>
+          <w:tcPr>
+            <w:tcW w:w="531" w:type="dxa"/>
           </w:tcPr>
           <w:p>
             <w:pPr>
@@ -2191,26 +2169,21 @@
               <w:jc w:val="right"/>
               <w:rPr>
                 <w:sz w:val="28"/>
-                <w:lang w:val="en-US"/>
-              </w:rPr>
-            </w:pPr>
-            <w:r>
-              <w:rPr>
-                <w:sz w:val="28"/>
-                <w:lang w:val="en-US"/>
-              </w:rPr>
-              <w:t>16</w:t>
+              </w:rPr>
+            </w:pPr>
+            <w:r>
+              <w:rPr>
+                <w:sz w:val="28"/>
+              </w:rPr>
+              <w:t>27</w:t>
             </w:r>
           </w:p>
         </w:tc>
       </w:tr>
       <w:tr>
-        <w:trPr>
-          <w:trHeight w:val="277"/>
-        </w:trPr>
-        <w:tc>
-          <w:tcPr>
-            <w:tcW w:w="9503" w:type="dxa"/>
+        <w:tc>
+          <w:tcPr>
+            <w:tcW w:w="9464" w:type="dxa"/>
           </w:tcPr>
           <w:p>
             <w:pPr>
@@ -2222,17 +2195,22 @@
             </w:pPr>
             <w:r>
               <w:rPr>
-                <w:bCs/>
-                <w:sz w:val="28"/>
-                <w:szCs w:val="28"/>
-              </w:rPr>
-              <w:t>2.1.3 Описание комплекса программ</w:t>
-            </w:r>
-          </w:p>
-        </w:tc>
-        <w:tc>
-          <w:tcPr>
-            <w:tcW w:w="634" w:type="dxa"/>
+                <w:sz w:val="28"/>
+              </w:rPr>
+              <w:t xml:space="preserve">2 </w:t>
+            </w:r>
+            <w:r>
+              <w:rPr>
+                <w:sz w:val="28"/>
+                <w:szCs w:val="28"/>
+              </w:rPr>
+              <w:t>СПЕЦИАЛЬНАЯ ЧАСТЬ</w:t>
+            </w:r>
+          </w:p>
+        </w:tc>
+        <w:tc>
+          <w:tcPr>
+            <w:tcW w:w="531" w:type="dxa"/>
           </w:tcPr>
           <w:p>
             <w:pPr>
@@ -2240,26 +2218,21 @@
               <w:jc w:val="right"/>
               <w:rPr>
                 <w:sz w:val="28"/>
-                <w:lang w:val="en-US"/>
-              </w:rPr>
-            </w:pPr>
-            <w:r>
-              <w:rPr>
-                <w:sz w:val="28"/>
-                <w:lang w:val="en-US"/>
-              </w:rPr>
-              <w:t>17</w:t>
+              </w:rPr>
+            </w:pPr>
+            <w:r>
+              <w:rPr>
+                <w:sz w:val="28"/>
+              </w:rPr>
+              <w:t>29</w:t>
             </w:r>
           </w:p>
         </w:tc>
       </w:tr>
       <w:tr>
-        <w:trPr>
-          <w:trHeight w:val="264"/>
-        </w:trPr>
-        <w:tc>
-          <w:tcPr>
-            <w:tcW w:w="9503" w:type="dxa"/>
+        <w:tc>
+          <w:tcPr>
+            <w:tcW w:w="9464" w:type="dxa"/>
           </w:tcPr>
           <w:p>
             <w:pPr>
@@ -2271,17 +2244,15 @@
             </w:pPr>
             <w:r>
               <w:rPr>
-                <w:bCs/>
-                <w:sz w:val="28"/>
-                <w:szCs w:val="28"/>
-              </w:rPr>
-              <w:t>2.1.4 Описание набора данных</w:t>
-            </w:r>
-          </w:p>
-        </w:tc>
-        <w:tc>
-          <w:tcPr>
-            <w:tcW w:w="634" w:type="dxa"/>
+                <w:sz w:val="28"/>
+              </w:rPr>
+              <w:t>2.1 Общая постановка задачи</w:t>
+            </w:r>
+          </w:p>
+        </w:tc>
+        <w:tc>
+          <w:tcPr>
+            <w:tcW w:w="531" w:type="dxa"/>
           </w:tcPr>
           <w:p>
             <w:pPr>
@@ -2289,26 +2260,21 @@
               <w:jc w:val="right"/>
               <w:rPr>
                 <w:sz w:val="28"/>
-                <w:lang w:val="en-US"/>
-              </w:rPr>
-            </w:pPr>
-            <w:r>
-              <w:rPr>
-                <w:sz w:val="28"/>
-                <w:lang w:val="en-US"/>
-              </w:rPr>
-              <w:t>17</w:t>
+              </w:rPr>
+            </w:pPr>
+            <w:r>
+              <w:rPr>
+                <w:sz w:val="28"/>
+              </w:rPr>
+              <w:t>29</w:t>
             </w:r>
           </w:p>
         </w:tc>
       </w:tr>
       <w:tr>
-        <w:trPr>
-          <w:trHeight w:val="264"/>
-        </w:trPr>
-        <w:tc>
-          <w:tcPr>
-            <w:tcW w:w="9503" w:type="dxa"/>
+        <w:tc>
+          <w:tcPr>
+            <w:tcW w:w="9464" w:type="dxa"/>
           </w:tcPr>
           <w:p>
             <w:pPr>
@@ -2323,13 +2289,13 @@
                 <w:sz w:val="28"/>
                 <w:szCs w:val="28"/>
               </w:rPr>
-              <w:t>2.3 Описание проблемных программ</w:t>
-            </w:r>
-          </w:p>
-        </w:tc>
-        <w:tc>
-          <w:tcPr>
-            <w:tcW w:w="634" w:type="dxa"/>
+              <w:t>2.1.1 Описание входных данных и выходных данных</w:t>
+            </w:r>
+          </w:p>
+        </w:tc>
+        <w:tc>
+          <w:tcPr>
+            <w:tcW w:w="531" w:type="dxa"/>
           </w:tcPr>
           <w:p>
             <w:pPr>
@@ -2337,26 +2303,21 @@
               <w:jc w:val="right"/>
               <w:rPr>
                 <w:sz w:val="28"/>
-                <w:lang w:val="en-US"/>
-              </w:rPr>
-            </w:pPr>
-            <w:r>
-              <w:rPr>
-                <w:sz w:val="28"/>
-                <w:lang w:val="en-US"/>
-              </w:rPr>
-              <w:t>18</w:t>
+              </w:rPr>
+            </w:pPr>
+            <w:r>
+              <w:rPr>
+                <w:sz w:val="28"/>
+              </w:rPr>
+              <w:t>29</w:t>
             </w:r>
           </w:p>
         </w:tc>
       </w:tr>
       <w:tr>
-        <w:trPr>
-          <w:trHeight w:val="277"/>
-        </w:trPr>
-        <w:tc>
-          <w:tcPr>
-            <w:tcW w:w="9503" w:type="dxa"/>
+        <w:tc>
+          <w:tcPr>
+            <w:tcW w:w="9464" w:type="dxa"/>
           </w:tcPr>
           <w:p>
             <w:pPr>
@@ -2371,13 +2332,13 @@
                 <w:sz w:val="28"/>
                 <w:szCs w:val="28"/>
               </w:rPr>
-              <w:t>2.3.1 Описание проблемной программы №1</w:t>
-            </w:r>
-          </w:p>
-        </w:tc>
-        <w:tc>
-          <w:tcPr>
-            <w:tcW w:w="634" w:type="dxa"/>
+              <w:t>2.1.2 Схема работы комплекса</w:t>
+            </w:r>
+          </w:p>
+        </w:tc>
+        <w:tc>
+          <w:tcPr>
+            <w:tcW w:w="531" w:type="dxa"/>
           </w:tcPr>
           <w:p>
             <w:pPr>
@@ -2385,26 +2346,21 @@
               <w:jc w:val="right"/>
               <w:rPr>
                 <w:sz w:val="28"/>
-                <w:lang w:val="en-US"/>
-              </w:rPr>
-            </w:pPr>
-            <w:r>
-              <w:rPr>
-                <w:sz w:val="28"/>
-                <w:lang w:val="en-US"/>
-              </w:rPr>
-              <w:t>18</w:t>
+              </w:rPr>
+            </w:pPr>
+            <w:r>
+              <w:rPr>
+                <w:sz w:val="28"/>
+              </w:rPr>
+              <w:t>29</w:t>
             </w:r>
           </w:p>
         </w:tc>
       </w:tr>
       <w:tr>
-        <w:trPr>
-          <w:trHeight w:val="264"/>
-        </w:trPr>
-        <w:tc>
-          <w:tcPr>
-            <w:tcW w:w="9503" w:type="dxa"/>
+        <w:tc>
+          <w:tcPr>
+            <w:tcW w:w="9464" w:type="dxa"/>
           </w:tcPr>
           <w:p>
             <w:pPr>
@@ -2416,16 +2372,17 @@
             </w:pPr>
             <w:r>
               <w:rPr>
-                <w:sz w:val="28"/>
-                <w:szCs w:val="28"/>
-              </w:rPr>
-              <w:t>2.3.1.1 Схема алгоритма проблемной программы №1</w:t>
-            </w:r>
-          </w:p>
-        </w:tc>
-        <w:tc>
-          <w:tcPr>
-            <w:tcW w:w="634" w:type="dxa"/>
+                <w:bCs/>
+                <w:sz w:val="28"/>
+                <w:szCs w:val="28"/>
+              </w:rPr>
+              <w:t>2.1.3 Описание комплекса программ</w:t>
+            </w:r>
+          </w:p>
+        </w:tc>
+        <w:tc>
+          <w:tcPr>
+            <w:tcW w:w="531" w:type="dxa"/>
           </w:tcPr>
           <w:p>
             <w:pPr>
@@ -2433,26 +2390,27 @@
               <w:jc w:val="right"/>
               <w:rPr>
                 <w:sz w:val="28"/>
-                <w:lang w:val="en-US"/>
-              </w:rPr>
-            </w:pPr>
-            <w:r>
-              <w:rPr>
-                <w:sz w:val="28"/>
-                <w:lang w:val="en-US"/>
-              </w:rPr>
-              <w:t>19</w:t>
+              </w:rPr>
+            </w:pPr>
+            <w:r>
+              <w:rPr>
+                <w:sz w:val="28"/>
+              </w:rPr>
+              <w:t>3</w:t>
+            </w:r>
+            <w:r>
+              <w:rPr>
+                <w:sz w:val="28"/>
+              </w:rPr>
+              <w:t>0</w:t>
             </w:r>
           </w:p>
         </w:tc>
       </w:tr>
       <w:tr>
-        <w:trPr>
-          <w:trHeight w:val="277"/>
-        </w:trPr>
-        <w:tc>
-          <w:tcPr>
-            <w:tcW w:w="9503" w:type="dxa"/>
+        <w:tc>
+          <w:tcPr>
+            <w:tcW w:w="9464" w:type="dxa"/>
           </w:tcPr>
           <w:p>
             <w:pPr>
@@ -2465,16 +2423,17 @@
             </w:pPr>
             <w:r>
               <w:rPr>
-                <w:sz w:val="28"/>
-                <w:szCs w:val="28"/>
-              </w:rPr>
-              <w:t>2.3.1.2 Таблица идентификаторов проблемной программы №1</w:t>
-            </w:r>
-          </w:p>
-        </w:tc>
-        <w:tc>
-          <w:tcPr>
-            <w:tcW w:w="634" w:type="dxa"/>
+                <w:bCs/>
+                <w:sz w:val="28"/>
+                <w:szCs w:val="28"/>
+              </w:rPr>
+              <w:t>2.1.4 Описание набора данных</w:t>
+            </w:r>
+          </w:p>
+        </w:tc>
+        <w:tc>
+          <w:tcPr>
+            <w:tcW w:w="531" w:type="dxa"/>
           </w:tcPr>
           <w:p>
             <w:pPr>
@@ -2482,26 +2441,27 @@
               <w:jc w:val="right"/>
               <w:rPr>
                 <w:sz w:val="28"/>
-                <w:lang w:val="en-US"/>
-              </w:rPr>
-            </w:pPr>
-            <w:r>
-              <w:rPr>
-                <w:sz w:val="28"/>
-                <w:lang w:val="en-US"/>
-              </w:rPr>
-              <w:t>19</w:t>
+              </w:rPr>
+            </w:pPr>
+            <w:r>
+              <w:rPr>
+                <w:sz w:val="28"/>
+              </w:rPr>
+              <w:t>3</w:t>
+            </w:r>
+            <w:r>
+              <w:rPr>
+                <w:sz w:val="28"/>
+              </w:rPr>
+              <w:t>0</w:t>
             </w:r>
           </w:p>
         </w:tc>
       </w:tr>
       <w:tr>
-        <w:trPr>
-          <w:trHeight w:val="264"/>
-        </w:trPr>
-        <w:tc>
-          <w:tcPr>
-            <w:tcW w:w="9503" w:type="dxa"/>
+        <w:tc>
+          <w:tcPr>
+            <w:tcW w:w="9464" w:type="dxa"/>
           </w:tcPr>
           <w:p>
             <w:pPr>
@@ -2517,13 +2477,13 @@
                 <w:sz w:val="28"/>
                 <w:szCs w:val="28"/>
               </w:rPr>
-              <w:t>2.3.2 Описание проблемной программы №2</w:t>
-            </w:r>
-          </w:p>
-        </w:tc>
-        <w:tc>
-          <w:tcPr>
-            <w:tcW w:w="634" w:type="dxa"/>
+              <w:t>2.3 Описание проблемных программ</w:t>
+            </w:r>
+          </w:p>
+        </w:tc>
+        <w:tc>
+          <w:tcPr>
+            <w:tcW w:w="531" w:type="dxa"/>
           </w:tcPr>
           <w:p>
             <w:pPr>
@@ -2531,26 +2491,27 @@
               <w:jc w:val="right"/>
               <w:rPr>
                 <w:sz w:val="28"/>
-                <w:lang w:val="en-US"/>
-              </w:rPr>
-            </w:pPr>
-            <w:r>
-              <w:rPr>
-                <w:sz w:val="28"/>
-                <w:lang w:val="en-US"/>
-              </w:rPr>
-              <w:t>20</w:t>
+              </w:rPr>
+            </w:pPr>
+            <w:r>
+              <w:rPr>
+                <w:sz w:val="28"/>
+              </w:rPr>
+              <w:t>3</w:t>
+            </w:r>
+            <w:r>
+              <w:rPr>
+                <w:sz w:val="28"/>
+              </w:rPr>
+              <w:t>1</w:t>
             </w:r>
           </w:p>
         </w:tc>
       </w:tr>
       <w:tr>
-        <w:trPr>
-          <w:trHeight w:val="277"/>
-        </w:trPr>
-        <w:tc>
-          <w:tcPr>
-            <w:tcW w:w="9503" w:type="dxa"/>
+        <w:tc>
+          <w:tcPr>
+            <w:tcW w:w="9464" w:type="dxa"/>
           </w:tcPr>
           <w:p>
             <w:pPr>
@@ -2566,13 +2527,13 @@
                 <w:sz w:val="28"/>
                 <w:szCs w:val="28"/>
               </w:rPr>
-              <w:t>2.3.1.1 Схема алгоритма проблемной программы №2</w:t>
-            </w:r>
-          </w:p>
-        </w:tc>
-        <w:tc>
-          <w:tcPr>
-            <w:tcW w:w="634" w:type="dxa"/>
+              <w:t>2.3.1 Описание проблемной программы №1</w:t>
+            </w:r>
+          </w:p>
+        </w:tc>
+        <w:tc>
+          <w:tcPr>
+            <w:tcW w:w="531" w:type="dxa"/>
           </w:tcPr>
           <w:p>
             <w:pPr>
@@ -2580,26 +2541,27 @@
               <w:jc w:val="right"/>
               <w:rPr>
                 <w:sz w:val="28"/>
-                <w:lang w:val="en-US"/>
-              </w:rPr>
-            </w:pPr>
-            <w:r>
-              <w:rPr>
-                <w:sz w:val="28"/>
-                <w:lang w:val="en-US"/>
-              </w:rPr>
-              <w:t>20</w:t>
+              </w:rPr>
+            </w:pPr>
+            <w:r>
+              <w:rPr>
+                <w:sz w:val="28"/>
+              </w:rPr>
+              <w:t>3</w:t>
+            </w:r>
+            <w:r>
+              <w:rPr>
+                <w:sz w:val="28"/>
+              </w:rPr>
+              <w:t>1</w:t>
             </w:r>
           </w:p>
         </w:tc>
       </w:tr>
       <w:tr>
-        <w:trPr>
-          <w:trHeight w:val="264"/>
-        </w:trPr>
-        <w:tc>
-          <w:tcPr>
-            <w:tcW w:w="9503" w:type="dxa"/>
+        <w:tc>
+          <w:tcPr>
+            <w:tcW w:w="9464" w:type="dxa"/>
           </w:tcPr>
           <w:p>
             <w:pPr>
@@ -2615,13 +2577,13 @@
                 <w:sz w:val="28"/>
                 <w:szCs w:val="28"/>
               </w:rPr>
-              <w:t>2.3.1.2 Таблица идентификаторов проблемной программы №2</w:t>
-            </w:r>
-          </w:p>
-        </w:tc>
-        <w:tc>
-          <w:tcPr>
-            <w:tcW w:w="634" w:type="dxa"/>
+              <w:t>2.3.1.1 Схема алгоритма проблемной программы №1</w:t>
+            </w:r>
+          </w:p>
+        </w:tc>
+        <w:tc>
+          <w:tcPr>
+            <w:tcW w:w="531" w:type="dxa"/>
           </w:tcPr>
           <w:p>
             <w:pPr>
@@ -2629,26 +2591,27 @@
               <w:jc w:val="right"/>
               <w:rPr>
                 <w:sz w:val="28"/>
-                <w:lang w:val="en-US"/>
-              </w:rPr>
-            </w:pPr>
-            <w:r>
-              <w:rPr>
-                <w:sz w:val="28"/>
-                <w:lang w:val="en-US"/>
-              </w:rPr>
-              <w:t>20</w:t>
+              </w:rPr>
+            </w:pPr>
+            <w:r>
+              <w:rPr>
+                <w:sz w:val="28"/>
+              </w:rPr>
+              <w:t>3</w:t>
+            </w:r>
+            <w:r>
+              <w:rPr>
+                <w:sz w:val="28"/>
+              </w:rPr>
+              <w:t>1</w:t>
             </w:r>
           </w:p>
         </w:tc>
       </w:tr>
       <w:tr>
-        <w:trPr>
-          <w:trHeight w:val="277"/>
-        </w:trPr>
-        <w:tc>
-          <w:tcPr>
-            <w:tcW w:w="9503" w:type="dxa"/>
+        <w:tc>
+          <w:tcPr>
+            <w:tcW w:w="9464" w:type="dxa"/>
           </w:tcPr>
           <w:p>
             <w:pPr>
@@ -2657,6 +2620,205 @@
               <w:rPr>
                 <w:sz w:val="28"/>
                 <w:szCs w:val="28"/>
+              </w:rPr>
+            </w:pPr>
+            <w:r>
+              <w:rPr>
+                <w:sz w:val="28"/>
+                <w:szCs w:val="28"/>
+              </w:rPr>
+              <w:t>2.3.1.2 Таблица идентификаторов проблемной программы №1</w:t>
+            </w:r>
+          </w:p>
+        </w:tc>
+        <w:tc>
+          <w:tcPr>
+            <w:tcW w:w="531" w:type="dxa"/>
+          </w:tcPr>
+          <w:p>
+            <w:pPr>
+              <w:ind w:right="-2"/>
+              <w:jc w:val="right"/>
+              <w:rPr>
+                <w:sz w:val="28"/>
+              </w:rPr>
+            </w:pPr>
+            <w:r>
+              <w:rPr>
+                <w:sz w:val="28"/>
+              </w:rPr>
+              <w:t>3</w:t>
+            </w:r>
+            <w:r>
+              <w:rPr>
+                <w:sz w:val="28"/>
+              </w:rPr>
+              <w:t>1</w:t>
+            </w:r>
+          </w:p>
+        </w:tc>
+      </w:tr>
+      <w:tr>
+        <w:tc>
+          <w:tcPr>
+            <w:tcW w:w="9464" w:type="dxa"/>
+          </w:tcPr>
+          <w:p>
+            <w:pPr>
+              <w:ind w:right="-2"/>
+              <w:jc w:val="both"/>
+              <w:rPr>
+                <w:sz w:val="28"/>
+                <w:szCs w:val="28"/>
+              </w:rPr>
+            </w:pPr>
+            <w:r>
+              <w:rPr>
+                <w:sz w:val="28"/>
+                <w:szCs w:val="28"/>
+              </w:rPr>
+              <w:t>2.3.2 Описание проблемной программы №2</w:t>
+            </w:r>
+          </w:p>
+        </w:tc>
+        <w:tc>
+          <w:tcPr>
+            <w:tcW w:w="531" w:type="dxa"/>
+          </w:tcPr>
+          <w:p>
+            <w:pPr>
+              <w:ind w:right="-2"/>
+              <w:jc w:val="right"/>
+              <w:rPr>
+                <w:sz w:val="28"/>
+              </w:rPr>
+            </w:pPr>
+            <w:r>
+              <w:rPr>
+                <w:sz w:val="28"/>
+              </w:rPr>
+              <w:t>3</w:t>
+            </w:r>
+            <w:r>
+              <w:rPr>
+                <w:sz w:val="28"/>
+              </w:rPr>
+              <w:t>1</w:t>
+            </w:r>
+          </w:p>
+        </w:tc>
+      </w:tr>
+      <w:tr>
+        <w:tc>
+          <w:tcPr>
+            <w:tcW w:w="9464" w:type="dxa"/>
+          </w:tcPr>
+          <w:p>
+            <w:pPr>
+              <w:ind w:right="-2"/>
+              <w:jc w:val="both"/>
+              <w:rPr>
+                <w:sz w:val="28"/>
+                <w:szCs w:val="28"/>
+              </w:rPr>
+            </w:pPr>
+            <w:r>
+              <w:rPr>
+                <w:sz w:val="28"/>
+                <w:szCs w:val="28"/>
+              </w:rPr>
+              <w:t>2.3.1.1 Схема алгоритма проблемной программы №2</w:t>
+            </w:r>
+          </w:p>
+        </w:tc>
+        <w:tc>
+          <w:tcPr>
+            <w:tcW w:w="531" w:type="dxa"/>
+          </w:tcPr>
+          <w:p>
+            <w:pPr>
+              <w:ind w:right="-2"/>
+              <w:jc w:val="right"/>
+              <w:rPr>
+                <w:sz w:val="28"/>
+              </w:rPr>
+            </w:pPr>
+            <w:r>
+              <w:rPr>
+                <w:sz w:val="28"/>
+              </w:rPr>
+              <w:t>3</w:t>
+            </w:r>
+            <w:r>
+              <w:rPr>
+                <w:sz w:val="28"/>
+              </w:rPr>
+              <w:t>2</w:t>
+            </w:r>
+          </w:p>
+        </w:tc>
+      </w:tr>
+      <w:tr>
+        <w:tc>
+          <w:tcPr>
+            <w:tcW w:w="9464" w:type="dxa"/>
+          </w:tcPr>
+          <w:p>
+            <w:pPr>
+              <w:ind w:right="-2"/>
+              <w:jc w:val="both"/>
+              <w:rPr>
+                <w:sz w:val="28"/>
+                <w:szCs w:val="28"/>
+              </w:rPr>
+            </w:pPr>
+            <w:r>
+              <w:rPr>
+                <w:sz w:val="28"/>
+                <w:szCs w:val="28"/>
+              </w:rPr>
+              <w:t>2.3.1.2 Таблица идентификаторов проблемной программы №2</w:t>
+            </w:r>
+          </w:p>
+        </w:tc>
+        <w:tc>
+          <w:tcPr>
+            <w:tcW w:w="531" w:type="dxa"/>
+          </w:tcPr>
+          <w:p>
+            <w:pPr>
+              <w:ind w:right="-2"/>
+              <w:jc w:val="right"/>
+              <w:rPr>
+                <w:sz w:val="28"/>
+              </w:rPr>
+            </w:pPr>
+            <w:r>
+              <w:rPr>
+                <w:sz w:val="28"/>
+              </w:rPr>
+              <w:t>3</w:t>
+            </w:r>
+            <w:r>
+              <w:rPr>
+                <w:sz w:val="28"/>
+              </w:rPr>
+              <w:t>2</w:t>
+            </w:r>
+          </w:p>
+        </w:tc>
+      </w:tr>
+      <w:tr>
+        <w:tc>
+          <w:tcPr>
+            <w:tcW w:w="9464" w:type="dxa"/>
+          </w:tcPr>
+          <w:p>
+            <w:pPr>
+              <w:ind w:right="-2"/>
+              <w:jc w:val="both"/>
+              <w:rPr>
+                <w:sz w:val="28"/>
               </w:rPr>
             </w:pPr>
             <w:r>
@@ -2680,7 +2842,7 @@
         </w:tc>
         <w:tc>
           <w:tcPr>
-            <w:tcW w:w="634" w:type="dxa"/>
+            <w:tcW w:w="531" w:type="dxa"/>
           </w:tcPr>
           <w:p>
             <w:pPr>
@@ -2688,33 +2850,27 @@
               <w:jc w:val="right"/>
               <w:rPr>
                 <w:sz w:val="28"/>
-                <w:lang w:val="en-US"/>
-              </w:rPr>
-            </w:pPr>
-            <w:r>
-              <w:rPr>
-                <w:sz w:val="28"/>
-                <w:lang w:val="en-US"/>
-              </w:rPr>
-              <w:t>2</w:t>
-            </w:r>
-            <w:r>
-              <w:rPr>
-                <w:sz w:val="28"/>
-                <w:lang w:val="en-US"/>
-              </w:rPr>
-              <w:t>1</w:t>
+              </w:rPr>
+            </w:pPr>
+            <w:r>
+              <w:rPr>
+                <w:sz w:val="28"/>
+              </w:rPr>
+              <w:t>3</w:t>
+            </w:r>
+            <w:r>
+              <w:rPr>
+                <w:sz w:val="28"/>
+              </w:rPr>
+              <w:t>3</w:t>
             </w:r>
           </w:p>
         </w:tc>
       </w:tr>
       <w:tr>
-        <w:trPr>
-          <w:trHeight w:val="264"/>
-        </w:trPr>
-        <w:tc>
-          <w:tcPr>
-            <w:tcW w:w="9503" w:type="dxa"/>
+        <w:tc>
+          <w:tcPr>
+            <w:tcW w:w="9464" w:type="dxa"/>
           </w:tcPr>
           <w:p>
             <w:pPr>
@@ -2722,7 +2878,6 @@
               <w:jc w:val="both"/>
               <w:rPr>
                 <w:sz w:val="28"/>
-                <w:szCs w:val="28"/>
               </w:rPr>
             </w:pPr>
             <w:r>
@@ -2736,7 +2891,7 @@
         </w:tc>
         <w:tc>
           <w:tcPr>
-            <w:tcW w:w="634" w:type="dxa"/>
+            <w:tcW w:w="531" w:type="dxa"/>
           </w:tcPr>
           <w:p>
             <w:pPr>
@@ -2744,26 +2899,27 @@
               <w:jc w:val="right"/>
               <w:rPr>
                 <w:sz w:val="28"/>
-                <w:lang w:val="en-US"/>
-              </w:rPr>
-            </w:pPr>
-            <w:r>
-              <w:rPr>
-                <w:sz w:val="28"/>
-                <w:lang w:val="en-US"/>
-              </w:rPr>
-              <w:t>21</w:t>
+              </w:rPr>
+            </w:pPr>
+            <w:r>
+              <w:rPr>
+                <w:sz w:val="28"/>
+              </w:rPr>
+              <w:t>3</w:t>
+            </w:r>
+            <w:r>
+              <w:rPr>
+                <w:sz w:val="28"/>
+              </w:rPr>
+              <w:t>3</w:t>
             </w:r>
           </w:p>
         </w:tc>
       </w:tr>
       <w:tr>
-        <w:trPr>
-          <w:trHeight w:val="277"/>
-        </w:trPr>
-        <w:tc>
-          <w:tcPr>
-            <w:tcW w:w="9503" w:type="dxa"/>
+        <w:tc>
+          <w:tcPr>
+            <w:tcW w:w="9464" w:type="dxa"/>
           </w:tcPr>
           <w:p>
             <w:pPr>
@@ -2771,7 +2927,6 @@
               <w:jc w:val="both"/>
               <w:rPr>
                 <w:sz w:val="28"/>
-                <w:szCs w:val="28"/>
               </w:rPr>
             </w:pPr>
             <w:r>
@@ -2785,7 +2940,7 @@
         </w:tc>
         <w:tc>
           <w:tcPr>
-            <w:tcW w:w="634" w:type="dxa"/>
+            <w:tcW w:w="531" w:type="dxa"/>
           </w:tcPr>
           <w:p>
             <w:pPr>
@@ -2793,26 +2948,27 @@
               <w:jc w:val="right"/>
               <w:rPr>
                 <w:sz w:val="28"/>
-                <w:lang w:val="en-US"/>
-              </w:rPr>
-            </w:pPr>
-            <w:r>
-              <w:rPr>
-                <w:sz w:val="28"/>
-                <w:lang w:val="en-US"/>
-              </w:rPr>
-              <w:t>21</w:t>
+              </w:rPr>
+            </w:pPr>
+            <w:r>
+              <w:rPr>
+                <w:sz w:val="28"/>
+              </w:rPr>
+              <w:t>3</w:t>
+            </w:r>
+            <w:r>
+              <w:rPr>
+                <w:sz w:val="28"/>
+              </w:rPr>
+              <w:t>3</w:t>
             </w:r>
           </w:p>
         </w:tc>
       </w:tr>
       <w:tr>
-        <w:trPr>
-          <w:trHeight w:val="264"/>
-        </w:trPr>
-        <w:tc>
-          <w:tcPr>
-            <w:tcW w:w="9503" w:type="dxa"/>
+        <w:tc>
+          <w:tcPr>
+            <w:tcW w:w="9464" w:type="dxa"/>
           </w:tcPr>
           <w:p>
             <w:pPr>
@@ -2820,35 +2976,20 @@
               <w:jc w:val="both"/>
               <w:rPr>
                 <w:sz w:val="28"/>
-                <w:szCs w:val="28"/>
-              </w:rPr>
-            </w:pPr>
-            <w:r>
-              <w:rPr>
-                <w:sz w:val="28"/>
-                <w:szCs w:val="28"/>
-              </w:rPr>
-              <w:t>3.</w:t>
-            </w:r>
-            <w:r>
-              <w:rPr>
-                <w:sz w:val="28"/>
-                <w:szCs w:val="28"/>
-              </w:rPr>
-              <w:t>3</w:t>
-            </w:r>
-            <w:r>
-              <w:rPr>
-                <w:sz w:val="28"/>
-                <w:szCs w:val="28"/>
-              </w:rPr>
-              <w:t xml:space="preserve"> Формы входных и выходных документов</w:t>
-            </w:r>
-          </w:p>
-        </w:tc>
-        <w:tc>
-          <w:tcPr>
-            <w:tcW w:w="634" w:type="dxa"/>
+              </w:rPr>
+            </w:pPr>
+            <w:r>
+              <w:rPr>
+                <w:sz w:val="28"/>
+                <w:szCs w:val="28"/>
+              </w:rPr>
+              <w:t>3.3 Тестирование системных и пользовательских ограничений</w:t>
+            </w:r>
+          </w:p>
+        </w:tc>
+        <w:tc>
+          <w:tcPr>
+            <w:tcW w:w="531" w:type="dxa"/>
           </w:tcPr>
           <w:p>
             <w:pPr>
@@ -2856,26 +2997,27 @@
               <w:jc w:val="right"/>
               <w:rPr>
                 <w:sz w:val="28"/>
-                <w:lang w:val="en-US"/>
-              </w:rPr>
-            </w:pPr>
-            <w:r>
-              <w:rPr>
-                <w:sz w:val="28"/>
-                <w:lang w:val="en-US"/>
-              </w:rPr>
-              <w:t>22</w:t>
+              </w:rPr>
+            </w:pPr>
+            <w:r>
+              <w:rPr>
+                <w:sz w:val="28"/>
+              </w:rPr>
+              <w:t>4</w:t>
+            </w:r>
+            <w:r>
+              <w:rPr>
+                <w:sz w:val="28"/>
+              </w:rPr>
+              <w:t>5</w:t>
             </w:r>
           </w:p>
         </w:tc>
       </w:tr>
       <w:tr>
-        <w:trPr>
-          <w:trHeight w:val="277"/>
-        </w:trPr>
-        <w:tc>
-          <w:tcPr>
-            <w:tcW w:w="9503" w:type="dxa"/>
+        <w:tc>
+          <w:tcPr>
+            <w:tcW w:w="9464" w:type="dxa"/>
           </w:tcPr>
           <w:p>
             <w:pPr>
@@ -2890,28 +3032,13 @@
                 <w:sz w:val="28"/>
                 <w:szCs w:val="28"/>
               </w:rPr>
-              <w:t>3.</w:t>
-            </w:r>
-            <w:r>
-              <w:rPr>
-                <w:sz w:val="28"/>
-                <w:szCs w:val="28"/>
-                <w:lang w:val="en-US"/>
-              </w:rPr>
-              <w:t>4</w:t>
-            </w:r>
-            <w:r>
-              <w:rPr>
-                <w:sz w:val="28"/>
-                <w:szCs w:val="28"/>
-              </w:rPr>
-              <w:t xml:space="preserve"> Структура записи файлов</w:t>
-            </w:r>
-          </w:p>
-        </w:tc>
-        <w:tc>
-          <w:tcPr>
-            <w:tcW w:w="634" w:type="dxa"/>
+              <w:t>3.4 Формы входных и выходных документов</w:t>
+            </w:r>
+          </w:p>
+        </w:tc>
+        <w:tc>
+          <w:tcPr>
+            <w:tcW w:w="531" w:type="dxa"/>
           </w:tcPr>
           <w:p>
             <w:pPr>
@@ -2919,26 +3046,21 @@
               <w:jc w:val="right"/>
               <w:rPr>
                 <w:sz w:val="28"/>
-                <w:lang w:val="en-US"/>
-              </w:rPr>
-            </w:pPr>
-            <w:r>
-              <w:rPr>
-                <w:sz w:val="28"/>
-                <w:lang w:val="en-US"/>
-              </w:rPr>
-              <w:t>22</w:t>
+              </w:rPr>
+            </w:pPr>
+            <w:r>
+              <w:rPr>
+                <w:sz w:val="28"/>
+              </w:rPr>
+              <w:t>45</w:t>
             </w:r>
           </w:p>
         </w:tc>
       </w:tr>
       <w:tr>
-        <w:trPr>
-          <w:trHeight w:val="264"/>
-        </w:trPr>
-        <w:tc>
-          <w:tcPr>
-            <w:tcW w:w="9503" w:type="dxa"/>
+        <w:tc>
+          <w:tcPr>
+            <w:tcW w:w="9464" w:type="dxa"/>
           </w:tcPr>
           <w:p>
             <w:pPr>
@@ -2953,13 +3075,13 @@
                 <w:sz w:val="28"/>
                 <w:szCs w:val="28"/>
               </w:rPr>
-              <w:t>ЗАКЛЮЧЕНИЕ</w:t>
-            </w:r>
-          </w:p>
-        </w:tc>
-        <w:tc>
-          <w:tcPr>
-            <w:tcW w:w="634" w:type="dxa"/>
+              <w:t>3.5 Структура записи файлов</w:t>
+            </w:r>
+          </w:p>
+        </w:tc>
+        <w:tc>
+          <w:tcPr>
+            <w:tcW w:w="531" w:type="dxa"/>
           </w:tcPr>
           <w:p>
             <w:pPr>
@@ -2967,26 +3089,21 @@
               <w:jc w:val="right"/>
               <w:rPr>
                 <w:sz w:val="28"/>
-                <w:lang w:val="en-US"/>
-              </w:rPr>
-            </w:pPr>
-            <w:r>
-              <w:rPr>
-                <w:sz w:val="28"/>
-                <w:lang w:val="en-US"/>
-              </w:rPr>
-              <w:t>23</w:t>
+              </w:rPr>
+            </w:pPr>
+            <w:r>
+              <w:rPr>
+                <w:sz w:val="28"/>
+              </w:rPr>
+              <w:t>46</w:t>
             </w:r>
           </w:p>
         </w:tc>
       </w:tr>
       <w:tr>
-        <w:trPr>
-          <w:trHeight w:val="264"/>
-        </w:trPr>
-        <w:tc>
-          <w:tcPr>
-            <w:tcW w:w="9503" w:type="dxa"/>
+        <w:tc>
+          <w:tcPr>
+            <w:tcW w:w="9464" w:type="dxa"/>
           </w:tcPr>
           <w:p>
             <w:pPr>
@@ -2994,20 +3111,21 @@
               <w:jc w:val="both"/>
               <w:rPr>
                 <w:sz w:val="28"/>
-              </w:rPr>
-            </w:pPr>
-            <w:r>
-              <w:rPr>
-                <w:sz w:val="28"/>
-                <w:szCs w:val="28"/>
-              </w:rPr>
-              <w:t>СПИСОК ЛИТЕРАТУРЫ</w:t>
-            </w:r>
-          </w:p>
-        </w:tc>
-        <w:tc>
-          <w:tcPr>
-            <w:tcW w:w="634" w:type="dxa"/>
+                <w:szCs w:val="28"/>
+              </w:rPr>
+            </w:pPr>
+            <w:r>
+              <w:rPr>
+                <w:sz w:val="28"/>
+                <w:szCs w:val="28"/>
+              </w:rPr>
+              <w:t>ЗАКЛЮЧЕНИЕ</w:t>
+            </w:r>
+          </w:p>
+        </w:tc>
+        <w:tc>
+          <w:tcPr>
+            <w:tcW w:w="531" w:type="dxa"/>
           </w:tcPr>
           <w:p>
             <w:pPr>
@@ -3015,26 +3133,21 @@
               <w:jc w:val="right"/>
               <w:rPr>
                 <w:sz w:val="28"/>
-                <w:lang w:val="en-US"/>
-              </w:rPr>
-            </w:pPr>
-            <w:r>
-              <w:rPr>
-                <w:sz w:val="28"/>
-                <w:lang w:val="en-US"/>
-              </w:rPr>
-              <w:t>24</w:t>
+              </w:rPr>
+            </w:pPr>
+            <w:r>
+              <w:rPr>
+                <w:sz w:val="28"/>
+              </w:rPr>
+              <w:t>47</w:t>
             </w:r>
           </w:p>
         </w:tc>
       </w:tr>
       <w:tr>
-        <w:trPr>
-          <w:trHeight w:val="277"/>
-        </w:trPr>
-        <w:tc>
-          <w:tcPr>
-            <w:tcW w:w="9503" w:type="dxa"/>
+        <w:tc>
+          <w:tcPr>
+            <w:tcW w:w="9464" w:type="dxa"/>
           </w:tcPr>
           <w:p>
             <w:pPr>
@@ -3042,20 +3155,21 @@
               <w:jc w:val="both"/>
               <w:rPr>
                 <w:sz w:val="28"/>
-              </w:rPr>
-            </w:pPr>
-            <w:r>
-              <w:rPr>
-                <w:sz w:val="28"/>
-                <w:szCs w:val="28"/>
-              </w:rPr>
-              <w:t>Приложения</w:t>
-            </w:r>
-          </w:p>
-        </w:tc>
-        <w:tc>
-          <w:tcPr>
-            <w:tcW w:w="634" w:type="dxa"/>
+                <w:szCs w:val="28"/>
+              </w:rPr>
+            </w:pPr>
+            <w:r>
+              <w:rPr>
+                <w:sz w:val="28"/>
+                <w:szCs w:val="28"/>
+              </w:rPr>
+              <w:t>СПИСОК ЛИТЕРАТУРЫ</w:t>
+            </w:r>
+          </w:p>
+        </w:tc>
+        <w:tc>
+          <w:tcPr>
+            <w:tcW w:w="531" w:type="dxa"/>
           </w:tcPr>
           <w:p>
             <w:pPr>
@@ -3063,26 +3177,21 @@
               <w:jc w:val="right"/>
               <w:rPr>
                 <w:sz w:val="28"/>
-                <w:lang w:val="en-US"/>
-              </w:rPr>
-            </w:pPr>
-            <w:r>
-              <w:rPr>
-                <w:sz w:val="28"/>
-                <w:lang w:val="en-US"/>
-              </w:rPr>
-              <w:t>25</w:t>
+              </w:rPr>
+            </w:pPr>
+            <w:r>
+              <w:rPr>
+                <w:sz w:val="28"/>
+              </w:rPr>
+              <w:t>48</w:t>
             </w:r>
           </w:p>
         </w:tc>
       </w:tr>
       <w:tr>
-        <w:trPr>
-          <w:trHeight w:val="264"/>
-        </w:trPr>
-        <w:tc>
-          <w:tcPr>
-            <w:tcW w:w="9503" w:type="dxa"/>
+        <w:tc>
+          <w:tcPr>
+            <w:tcW w:w="9464" w:type="dxa"/>
           </w:tcPr>
           <w:p>
             <w:pPr>
@@ -3090,34 +3199,21 @@
               <w:jc w:val="both"/>
               <w:rPr>
                 <w:sz w:val="28"/>
-              </w:rPr>
-            </w:pPr>
-            <w:r>
-              <w:rPr>
-                <w:sz w:val="28"/>
-                <w:szCs w:val="28"/>
-              </w:rPr>
-              <w:t xml:space="preserve">Приложение А – </w:t>
-            </w:r>
-            <w:r>
-              <w:rPr>
-                <w:sz w:val="28"/>
-                <w:szCs w:val="28"/>
-              </w:rPr>
-              <w:t>Л</w:t>
-            </w:r>
-            <w:r>
-              <w:rPr>
-                <w:sz w:val="28"/>
-                <w:szCs w:val="28"/>
-              </w:rPr>
-              <w:t>истинг программы</w:t>
-            </w:r>
-          </w:p>
-        </w:tc>
-        <w:tc>
-          <w:tcPr>
-            <w:tcW w:w="634" w:type="dxa"/>
+                <w:szCs w:val="28"/>
+              </w:rPr>
+            </w:pPr>
+            <w:r>
+              <w:rPr>
+                <w:sz w:val="28"/>
+                <w:szCs w:val="28"/>
+              </w:rPr>
+              <w:t>Приложения</w:t>
+            </w:r>
+          </w:p>
+        </w:tc>
+        <w:tc>
+          <w:tcPr>
+            <w:tcW w:w="531" w:type="dxa"/>
           </w:tcPr>
           <w:p>
             <w:pPr>
@@ -3125,26 +3221,21 @@
               <w:jc w:val="right"/>
               <w:rPr>
                 <w:sz w:val="28"/>
-                <w:lang w:val="en-US"/>
-              </w:rPr>
-            </w:pPr>
-            <w:r>
-              <w:rPr>
-                <w:sz w:val="28"/>
-                <w:lang w:val="en-US"/>
-              </w:rPr>
-              <w:t>26</w:t>
+              </w:rPr>
+            </w:pPr>
+            <w:r>
+              <w:rPr>
+                <w:sz w:val="28"/>
+              </w:rPr>
+              <w:t>49</w:t>
             </w:r>
           </w:p>
         </w:tc>
       </w:tr>
       <w:tr>
-        <w:trPr>
-          <w:trHeight w:val="277"/>
-        </w:trPr>
-        <w:tc>
-          <w:tcPr>
-            <w:tcW w:w="9503" w:type="dxa"/>
+        <w:tc>
+          <w:tcPr>
+            <w:tcW w:w="9464" w:type="dxa"/>
           </w:tcPr>
           <w:p>
             <w:pPr>
@@ -3152,20 +3243,35 @@
               <w:jc w:val="both"/>
               <w:rPr>
                 <w:sz w:val="28"/>
-              </w:rPr>
-            </w:pPr>
-            <w:r>
-              <w:rPr>
-                <w:sz w:val="28"/>
-                <w:szCs w:val="28"/>
-              </w:rPr>
-              <w:t>Приложение Б – Входные данные</w:t>
-            </w:r>
-          </w:p>
-        </w:tc>
-        <w:tc>
-          <w:tcPr>
-            <w:tcW w:w="634" w:type="dxa"/>
+                <w:szCs w:val="28"/>
+              </w:rPr>
+            </w:pPr>
+            <w:r>
+              <w:rPr>
+                <w:sz w:val="28"/>
+                <w:szCs w:val="28"/>
+              </w:rPr>
+              <w:t xml:space="preserve">Приложение А – </w:t>
+            </w:r>
+            <w:r>
+              <w:rPr>
+                <w:sz w:val="28"/>
+                <w:szCs w:val="28"/>
+              </w:rPr>
+              <w:t>Л</w:t>
+            </w:r>
+            <w:r>
+              <w:rPr>
+                <w:sz w:val="28"/>
+                <w:szCs w:val="28"/>
+              </w:rPr>
+              <w:t>истинг программы</w:t>
+            </w:r>
+          </w:p>
+        </w:tc>
+        <w:tc>
+          <w:tcPr>
+            <w:tcW w:w="531" w:type="dxa"/>
           </w:tcPr>
           <w:p>
             <w:pPr>
@@ -3173,224 +3279,14 @@
               <w:jc w:val="right"/>
               <w:rPr>
                 <w:sz w:val="28"/>
-                <w:lang w:val="en-US"/>
-              </w:rPr>
-            </w:pPr>
-            <w:r>
-              <w:rPr>
-                <w:sz w:val="28"/>
-                <w:lang w:val="en-US"/>
-              </w:rPr>
-              <w:t>32</w:t>
-            </w:r>
-          </w:p>
-        </w:tc>
-      </w:tr>
-      <w:tr>
-        <w:trPr>
-          <w:trHeight w:val="277"/>
-        </w:trPr>
-        <w:tc>
-          <w:tcPr>
-            <w:tcW w:w="9503" w:type="dxa"/>
-          </w:tcPr>
-          <w:p>
-            <w:pPr>
-              <w:ind w:right="-2"/>
-              <w:jc w:val="both"/>
-              <w:rPr>
-                <w:sz w:val="28"/>
-                <w:szCs w:val="28"/>
-              </w:rPr>
-            </w:pPr>
-            <w:r>
-              <w:rPr>
-                <w:sz w:val="28"/>
-                <w:szCs w:val="28"/>
-              </w:rPr>
-              <w:t>Приложение В – Выходные данные</w:t>
-            </w:r>
-          </w:p>
-        </w:tc>
-        <w:tc>
-          <w:tcPr>
-            <w:tcW w:w="634" w:type="dxa"/>
-          </w:tcPr>
-          <w:p>
-            <w:pPr>
-              <w:ind w:right="-2"/>
-              <w:jc w:val="right"/>
-              <w:rPr>
-                <w:sz w:val="28"/>
-                <w:lang w:val="en-US"/>
-              </w:rPr>
-            </w:pPr>
-            <w:r>
-              <w:rPr>
-                <w:sz w:val="28"/>
-                <w:lang w:val="en-US"/>
-              </w:rPr>
-              <w:t>33</w:t>
-            </w:r>
-          </w:p>
-        </w:tc>
-      </w:tr>
-      <w:tr>
-        <w:trPr>
-          <w:trHeight w:val="277"/>
-        </w:trPr>
-        <w:tc>
-          <w:tcPr>
-            <w:tcW w:w="9503" w:type="dxa"/>
-          </w:tcPr>
-          <w:p>
-            <w:pPr>
-              <w:ind w:right="-2"/>
-              <w:jc w:val="both"/>
-              <w:rPr>
-                <w:sz w:val="28"/>
-                <w:szCs w:val="28"/>
-              </w:rPr>
-            </w:pPr>
-            <w:r>
-              <w:rPr>
-                <w:sz w:val="28"/>
-                <w:szCs w:val="28"/>
-              </w:rPr>
-              <w:t>Приложение Г – Схема работы комплекса</w:t>
-            </w:r>
-          </w:p>
-        </w:tc>
-        <w:tc>
-          <w:tcPr>
-            <w:tcW w:w="634" w:type="dxa"/>
-          </w:tcPr>
-          <w:p>
-            <w:pPr>
-              <w:ind w:right="-2"/>
-              <w:jc w:val="right"/>
-              <w:rPr>
-                <w:sz w:val="28"/>
-                <w:lang w:val="en-US"/>
-              </w:rPr>
-            </w:pPr>
-            <w:r>
-              <w:rPr>
-                <w:sz w:val="28"/>
-                <w:lang w:val="en-US"/>
-              </w:rPr>
-              <w:t>34</w:t>
-            </w:r>
-          </w:p>
-        </w:tc>
-      </w:tr>
-      <w:tr>
-        <w:trPr>
-          <w:trHeight w:val="277"/>
-        </w:trPr>
-        <w:tc>
-          <w:tcPr>
-            <w:tcW w:w="9503" w:type="dxa"/>
-          </w:tcPr>
-          <w:p>
-            <w:pPr>
-              <w:ind w:right="-2"/>
-              <w:jc w:val="both"/>
-              <w:rPr>
-                <w:sz w:val="28"/>
-                <w:szCs w:val="28"/>
-              </w:rPr>
-            </w:pPr>
-            <w:r>
-              <w:rPr>
-                <w:bCs/>
-                <w:sz w:val="28"/>
-                <w:szCs w:val="28"/>
-                <w:lang w:val="kk-KZ"/>
-              </w:rPr>
-              <w:t xml:space="preserve">Приложение Д </w:t>
-            </w:r>
-            <w:r>
-              <w:rPr>
-                <w:bCs/>
-                <w:sz w:val="28"/>
-                <w:szCs w:val="28"/>
-              </w:rPr>
-              <w:t xml:space="preserve">- </w:t>
-            </w:r>
-            <w:r>
-              <w:rPr>
-                <w:bCs/>
-                <w:sz w:val="28"/>
-                <w:szCs w:val="28"/>
-              </w:rPr>
-              <w:t xml:space="preserve">Схема </w:t>
-            </w:r>
-            <w:r>
-              <w:rPr>
-                <w:bCs/>
-                <w:sz w:val="28"/>
-                <w:szCs w:val="28"/>
-                <w:lang w:val="kk-KZ"/>
-              </w:rPr>
-              <w:t>взаимодействия таблиц базы данных</w:t>
-            </w:r>
-          </w:p>
-        </w:tc>
-        <w:tc>
-          <w:tcPr>
-            <w:tcW w:w="634" w:type="dxa"/>
-          </w:tcPr>
-          <w:p>
-            <w:pPr>
-              <w:ind w:right="-2"/>
-              <w:jc w:val="right"/>
-              <w:rPr>
-                <w:sz w:val="28"/>
-                <w:lang w:val="en-US"/>
-              </w:rPr>
-            </w:pPr>
-            <w:r>
-              <w:rPr>
-                <w:sz w:val="28"/>
-                <w:lang w:val="en-US"/>
-              </w:rPr>
-              <w:t>35</w:t>
-            </w:r>
-          </w:p>
-        </w:tc>
-      </w:tr>
-      <w:tr>
-        <w:trPr>
-          <w:trHeight w:val="277"/>
-        </w:trPr>
-        <w:tc>
-          <w:tcPr>
-            <w:tcW w:w="9503" w:type="dxa"/>
-          </w:tcPr>
-          <w:p>
-            <w:pPr>
-              <w:ind w:right="-2"/>
-              <w:jc w:val="both"/>
-              <w:rPr>
-                <w:sz w:val="28"/>
-                <w:szCs w:val="28"/>
-              </w:rPr>
-            </w:pPr>
-          </w:p>
-        </w:tc>
-        <w:tc>
-          <w:tcPr>
-            <w:tcW w:w="634" w:type="dxa"/>
-          </w:tcPr>
-          <w:p>
-            <w:pPr>
-              <w:ind w:right="-2"/>
-              <w:jc w:val="right"/>
-              <w:rPr>
-                <w:sz w:val="28"/>
-              </w:rPr>
-            </w:pPr>
+              </w:rPr>
+            </w:pPr>
+            <w:r>
+              <w:rPr>
+                <w:sz w:val="28"/>
+              </w:rPr>
+              <w:t>50</w:t>
+            </w:r>
           </w:p>
         </w:tc>
       </w:tr>
@@ -3398,6 +3294,946 @@
     <w:p>
       <w:pPr>
         <w:ind w:right="-2"/>
+        <w:jc w:val="right"/>
+        <w:rPr>
+          <w:sz w:val="28"/>
+        </w:rPr>
+      </w:pPr>
+      <w:r>
+        <w:rPr>
+          <w:sz w:val="28"/>
+          <w:lang w:val="en-US"/>
+        </w:rPr>
+        <w:br w:type="page"/>
+      </w:r>
+      <w:r>
+        <w:rPr>
+          <w:noProof/>
+          <w:sz w:val="28"/>
+        </w:rPr>
+        <w:lastRenderedPageBreak/>
+        <w:pict w14:anchorId="0DD321AE">
+          <v:group id="_x0000_s1103" style="position:absolute;left:0;text-align:left;margin-left:56.7pt;margin-top:19.85pt;width:518.9pt;height:802.2pt;z-index:251657216;mso-position-horizontal-relative:page;mso-position-vertical-relative:page" coordorigin="1134,397" coordsize="10378,16044">
+            <v:line id="_x0000_s1104" style="position:absolute" from="1134,397" to="1134,16441" strokeweight="2.25pt"/>
+            <v:line id="_x0000_s1105" style="position:absolute" from="11509,397" to="11509,16441" strokeweight="2.25pt"/>
+            <v:line id="_x0000_s1106" style="position:absolute" from="1137,16441" to="11512,16441" strokeweight="2.25pt"/>
+            <v:line id="_x0000_s1107" style="position:absolute" from="1134,15591" to="11509,15591" strokeweight="2.25pt"/>
+            <v:line id="_x0000_s1108" style="position:absolute" from="1134,397" to="11509,397" strokeweight="2.25pt"/>
+            <v:shape id="_x0000_s1109" type="#_x0000_t202" style="position:absolute;left:1137;top:15591;width:10375;height:850" filled="f" stroked="f" strokeweight="2.25pt">
+              <v:textbox style="mso-next-textbox:#_x0000_s1109" inset="0,0,0,0">
+                <w:txbxContent>
+                  <w:tbl>
+                    <w:tblPr>
+                      <w:tblW w:w="0" w:type="auto"/>
+                      <w:tblInd w:w="28" w:type="dxa"/>
+                      <w:tblBorders>
+                        <w:top w:val="single" w:sz="4" w:space="0" w:color="auto"/>
+                        <w:left w:val="single" w:sz="4" w:space="0" w:color="auto"/>
+                        <w:bottom w:val="single" w:sz="4" w:space="0" w:color="auto"/>
+                        <w:right w:val="single" w:sz="4" w:space="0" w:color="auto"/>
+                        <w:insideH w:val="single" w:sz="4" w:space="0" w:color="auto"/>
+                        <w:insideV w:val="single" w:sz="4" w:space="0" w:color="auto"/>
+                      </w:tblBorders>
+                      <w:tblLayout w:type="fixed"/>
+                      <w:tblCellMar>
+                        <w:left w:w="28" w:type="dxa"/>
+                        <w:right w:w="28" w:type="dxa"/>
+                      </w:tblCellMar>
+                      <w:tblLook w:val="0000" w:firstRow="0" w:lastRow="0" w:firstColumn="0" w:lastColumn="0" w:noHBand="0" w:noVBand="0"/>
+                    </w:tblPr>
+                    <w:tblGrid>
+                      <w:gridCol w:w="397"/>
+                      <w:gridCol w:w="567"/>
+                      <w:gridCol w:w="1304"/>
+                      <w:gridCol w:w="851"/>
+                      <w:gridCol w:w="567"/>
+                      <w:gridCol w:w="6095"/>
+                      <w:gridCol w:w="567"/>
+                    </w:tblGrid>
+                    <w:tr>
+                      <w:trPr>
+                        <w:cantSplit/>
+                        <w:trHeight w:hRule="exact" w:val="284"/>
+                      </w:trPr>
+                      <w:tc>
+                        <w:tcPr>
+                          <w:tcW w:w="397" w:type="dxa"/>
+                          <w:tcBorders>
+                            <w:top w:val="nil"/>
+                            <w:left w:val="nil"/>
+                            <w:right w:val="single" w:sz="18" w:space="0" w:color="auto"/>
+                          </w:tcBorders>
+                          <w:vAlign w:val="center"/>
+                        </w:tcPr>
+                        <w:p>
+                          <w:pPr>
+                            <w:pStyle w:val="a"/>
+                            <w:rPr>
+                              <w:sz w:val="18"/>
+                            </w:rPr>
+                          </w:pPr>
+                        </w:p>
+                      </w:tc>
+                      <w:tc>
+                        <w:tcPr>
+                          <w:tcW w:w="567" w:type="dxa"/>
+                          <w:tcBorders>
+                            <w:top w:val="nil"/>
+                            <w:left w:val="nil"/>
+                            <w:right w:val="single" w:sz="18" w:space="0" w:color="auto"/>
+                          </w:tcBorders>
+                          <w:vAlign w:val="center"/>
+                        </w:tcPr>
+                        <w:p>
+                          <w:pPr>
+                            <w:pStyle w:val="a"/>
+                            <w:rPr>
+                              <w:sz w:val="18"/>
+                            </w:rPr>
+                          </w:pPr>
+                        </w:p>
+                      </w:tc>
+                      <w:tc>
+                        <w:tcPr>
+                          <w:tcW w:w="1304" w:type="dxa"/>
+                          <w:tcBorders>
+                            <w:top w:val="nil"/>
+                            <w:left w:val="nil"/>
+                            <w:right w:val="nil"/>
+                          </w:tcBorders>
+                          <w:vAlign w:val="center"/>
+                        </w:tcPr>
+                        <w:p>
+                          <w:pPr>
+                            <w:pStyle w:val="a"/>
+                            <w:rPr>
+                              <w:sz w:val="18"/>
+                            </w:rPr>
+                          </w:pPr>
+                        </w:p>
+                      </w:tc>
+                      <w:tc>
+                        <w:tcPr>
+                          <w:tcW w:w="851" w:type="dxa"/>
+                          <w:tcBorders>
+                            <w:top w:val="nil"/>
+                            <w:left w:val="single" w:sz="18" w:space="0" w:color="auto"/>
+                            <w:right w:val="single" w:sz="18" w:space="0" w:color="auto"/>
+                          </w:tcBorders>
+                          <w:vAlign w:val="center"/>
+                        </w:tcPr>
+                        <w:p>
+                          <w:pPr>
+                            <w:pStyle w:val="a"/>
+                            <w:rPr>
+                              <w:sz w:val="18"/>
+                            </w:rPr>
+                          </w:pPr>
+                        </w:p>
+                      </w:tc>
+                      <w:tc>
+                        <w:tcPr>
+                          <w:tcW w:w="567" w:type="dxa"/>
+                          <w:tcBorders>
+                            <w:top w:val="nil"/>
+                            <w:left w:val="nil"/>
+                            <w:right w:val="single" w:sz="18" w:space="0" w:color="auto"/>
+                          </w:tcBorders>
+                          <w:vAlign w:val="center"/>
+                        </w:tcPr>
+                        <w:p>
+                          <w:pPr>
+                            <w:pStyle w:val="a"/>
+                            <w:rPr>
+                              <w:sz w:val="18"/>
+                            </w:rPr>
+                          </w:pPr>
+                        </w:p>
+                      </w:tc>
+                      <w:tc>
+                        <w:tcPr>
+                          <w:tcW w:w="6095" w:type="dxa"/>
+                          <w:vMerge w:val="restart"/>
+                          <w:tcBorders>
+                            <w:top w:val="nil"/>
+                            <w:left w:val="nil"/>
+                            <w:bottom w:val="nil"/>
+                            <w:right w:val="single" w:sz="18" w:space="0" w:color="auto"/>
+                          </w:tcBorders>
+                          <w:vAlign w:val="center"/>
+                        </w:tcPr>
+                        <w:p>
+                          <w:pPr>
+                            <w:pStyle w:val="a"/>
+                            <w:jc w:val="center"/>
+                            <w:rPr>
+                              <w:rFonts w:ascii="Times New Roman" w:hAnsi="Times New Roman"/>
+                              <w:lang w:val="en-US"/>
+                            </w:rPr>
+                          </w:pPr>
+                          <w:r>
+                            <w:rPr>
+                              <w:rFonts w:ascii="Times New Roman" w:hAnsi="Times New Roman"/>
+                              <w:lang w:val="ru-RU"/>
+                            </w:rPr>
+                            <w:t xml:space="preserve">РК ЦАТЭК </w:t>
+                          </w:r>
+                          <w:r>
+                            <w:rPr>
+                              <w:rFonts w:ascii="Times New Roman" w:hAnsi="Times New Roman"/>
+                              <w:lang w:val="ru-RU"/>
+                            </w:rPr>
+                            <w:t>4S0613010</w:t>
+                          </w:r>
+                          <w:r>
+                            <w:rPr>
+                              <w:rFonts w:ascii="Times New Roman" w:hAnsi="Times New Roman"/>
+                              <w:lang w:val="ru-RU"/>
+                            </w:rPr>
+                            <w:t>К</w:t>
+                          </w:r>
+                          <w:r>
+                            <w:rPr>
+                              <w:rFonts w:ascii="Times New Roman" w:hAnsi="Times New Roman"/>
+                              <w:lang w:val="ru-RU"/>
+                            </w:rPr>
+                            <w:t>П ПЗ</w:t>
+                          </w:r>
+                        </w:p>
+                      </w:tc>
+                      <w:tc>
+                        <w:tcPr>
+                          <w:tcW w:w="567" w:type="dxa"/>
+                          <w:tcBorders>
+                            <w:top w:val="nil"/>
+                            <w:left w:val="nil"/>
+                            <w:bottom w:val="single" w:sz="18" w:space="0" w:color="auto"/>
+                            <w:right w:val="nil"/>
+                          </w:tcBorders>
+                          <w:vAlign w:val="center"/>
+                        </w:tcPr>
+                        <w:p>
+                          <w:pPr>
+                            <w:pStyle w:val="a"/>
+                            <w:jc w:val="center"/>
+                          </w:pPr>
+                          <w:r>
+                            <w:rPr>
+                              <w:sz w:val="18"/>
+                            </w:rPr>
+                            <w:t>Лист</w:t>
+                          </w:r>
+                        </w:p>
+                      </w:tc>
+                    </w:tr>
+                    <w:tr>
+                      <w:trPr>
+                        <w:cantSplit/>
+                        <w:trHeight w:hRule="exact" w:val="284"/>
+                      </w:trPr>
+                      <w:tc>
+                        <w:tcPr>
+                          <w:tcW w:w="397" w:type="dxa"/>
+                          <w:tcBorders>
+                            <w:left w:val="nil"/>
+                            <w:bottom w:val="nil"/>
+                            <w:right w:val="single" w:sz="18" w:space="0" w:color="auto"/>
+                          </w:tcBorders>
+                          <w:vAlign w:val="center"/>
+                        </w:tcPr>
+                        <w:p>
+                          <w:pPr>
+                            <w:pStyle w:val="a"/>
+                            <w:rPr>
+                              <w:sz w:val="18"/>
+                            </w:rPr>
+                          </w:pPr>
+                        </w:p>
+                      </w:tc>
+                      <w:tc>
+                        <w:tcPr>
+                          <w:tcW w:w="567" w:type="dxa"/>
+                          <w:tcBorders>
+                            <w:left w:val="nil"/>
+                            <w:bottom w:val="nil"/>
+                            <w:right w:val="single" w:sz="18" w:space="0" w:color="auto"/>
+                          </w:tcBorders>
+                          <w:vAlign w:val="center"/>
+                        </w:tcPr>
+                        <w:p>
+                          <w:pPr>
+                            <w:pStyle w:val="a"/>
+                            <w:rPr>
+                              <w:sz w:val="18"/>
+                            </w:rPr>
+                          </w:pPr>
+                        </w:p>
+                      </w:tc>
+                      <w:tc>
+                        <w:tcPr>
+                          <w:tcW w:w="1304" w:type="dxa"/>
+                          <w:tcBorders>
+                            <w:left w:val="nil"/>
+                            <w:bottom w:val="nil"/>
+                            <w:right w:val="nil"/>
+                          </w:tcBorders>
+                          <w:vAlign w:val="center"/>
+                        </w:tcPr>
+                        <w:p>
+                          <w:pPr>
+                            <w:pStyle w:val="a"/>
+                            <w:rPr>
+                              <w:sz w:val="18"/>
+                            </w:rPr>
+                          </w:pPr>
+                        </w:p>
+                      </w:tc>
+                      <w:tc>
+                        <w:tcPr>
+                          <w:tcW w:w="851" w:type="dxa"/>
+                          <w:tcBorders>
+                            <w:left w:val="single" w:sz="18" w:space="0" w:color="auto"/>
+                            <w:bottom w:val="nil"/>
+                            <w:right w:val="single" w:sz="18" w:space="0" w:color="auto"/>
+                          </w:tcBorders>
+                          <w:vAlign w:val="center"/>
+                        </w:tcPr>
+                        <w:p>
+                          <w:pPr>
+                            <w:pStyle w:val="a"/>
+                            <w:rPr>
+                              <w:sz w:val="18"/>
+                            </w:rPr>
+                          </w:pPr>
+                        </w:p>
+                      </w:tc>
+                      <w:tc>
+                        <w:tcPr>
+                          <w:tcW w:w="567" w:type="dxa"/>
+                          <w:tcBorders>
+                            <w:left w:val="nil"/>
+                            <w:bottom w:val="nil"/>
+                            <w:right w:val="single" w:sz="18" w:space="0" w:color="auto"/>
+                          </w:tcBorders>
+                          <w:vAlign w:val="center"/>
+                        </w:tcPr>
+                        <w:p>
+                          <w:pPr>
+                            <w:pStyle w:val="a"/>
+                            <w:rPr>
+                              <w:sz w:val="18"/>
+                            </w:rPr>
+                          </w:pPr>
+                        </w:p>
+                      </w:tc>
+                      <w:tc>
+                        <w:tcPr>
+                          <w:tcW w:w="6095" w:type="dxa"/>
+                          <w:vMerge/>
+                          <w:tcBorders>
+                            <w:top w:val="single" w:sz="18" w:space="0" w:color="auto"/>
+                            <w:left w:val="nil"/>
+                            <w:bottom w:val="nil"/>
+                            <w:right w:val="single" w:sz="18" w:space="0" w:color="auto"/>
+                          </w:tcBorders>
+                          <w:vAlign w:val="center"/>
+                        </w:tcPr>
+                        <w:p>
+                          <w:pPr>
+                            <w:pStyle w:val="a"/>
+                            <w:rPr>
+                              <w:sz w:val="18"/>
+                            </w:rPr>
+                          </w:pPr>
+                        </w:p>
+                      </w:tc>
+                      <w:tc>
+                        <w:tcPr>
+                          <w:tcW w:w="567" w:type="dxa"/>
+                          <w:vMerge w:val="restart"/>
+                          <w:tcBorders>
+                            <w:top w:val="single" w:sz="18" w:space="0" w:color="auto"/>
+                            <w:left w:val="nil"/>
+                            <w:bottom w:val="single" w:sz="18" w:space="0" w:color="auto"/>
+                            <w:right w:val="nil"/>
+                          </w:tcBorders>
+                          <w:vAlign w:val="center"/>
+                        </w:tcPr>
+                        <w:p>
+                          <w:pPr>
+                            <w:pStyle w:val="a"/>
+                            <w:jc w:val="center"/>
+                            <w:rPr>
+                              <w:sz w:val="18"/>
+                              <w:lang w:val="ru-RU"/>
+                            </w:rPr>
+                          </w:pPr>
+                          <w:r>
+                            <w:rPr>
+                              <w:sz w:val="18"/>
+                              <w:lang w:val="ru-RU"/>
+                            </w:rPr>
+                            <w:t>7</w:t>
+                          </w:r>
+                        </w:p>
+                      </w:tc>
+                    </w:tr>
+                    <w:tr>
+                      <w:trPr>
+                        <w:cantSplit/>
+                        <w:trHeight w:hRule="exact" w:val="284"/>
+                      </w:trPr>
+                      <w:tc>
+                        <w:tcPr>
+                          <w:tcW w:w="397" w:type="dxa"/>
+                          <w:tcBorders>
+                            <w:top w:val="single" w:sz="18" w:space="0" w:color="auto"/>
+                            <w:left w:val="nil"/>
+                            <w:bottom w:val="nil"/>
+                            <w:right w:val="single" w:sz="18" w:space="0" w:color="auto"/>
+                          </w:tcBorders>
+                          <w:vAlign w:val="center"/>
+                        </w:tcPr>
+                        <w:p>
+                          <w:pPr>
+                            <w:pStyle w:val="a"/>
+                            <w:jc w:val="center"/>
+                            <w:rPr>
+                              <w:sz w:val="18"/>
+                            </w:rPr>
+                          </w:pPr>
+                          <w:r>
+                            <w:rPr>
+                              <w:sz w:val="18"/>
+                            </w:rPr>
+                            <w:t>Изм.</w:t>
+                          </w:r>
+                        </w:p>
+                      </w:tc>
+                      <w:tc>
+                        <w:tcPr>
+                          <w:tcW w:w="567" w:type="dxa"/>
+                          <w:tcBorders>
+                            <w:top w:val="single" w:sz="18" w:space="0" w:color="auto"/>
+                            <w:left w:val="nil"/>
+                            <w:bottom w:val="nil"/>
+                            <w:right w:val="single" w:sz="18" w:space="0" w:color="auto"/>
+                          </w:tcBorders>
+                          <w:vAlign w:val="center"/>
+                        </w:tcPr>
+                        <w:p>
+                          <w:pPr>
+                            <w:pStyle w:val="a"/>
+                            <w:jc w:val="center"/>
+                            <w:rPr>
+                              <w:sz w:val="18"/>
+                            </w:rPr>
+                          </w:pPr>
+                          <w:r>
+                            <w:rPr>
+                              <w:sz w:val="18"/>
+                            </w:rPr>
+                            <w:t>Лист</w:t>
+                          </w:r>
+                        </w:p>
+                      </w:tc>
+                      <w:tc>
+                        <w:tcPr>
+                          <w:tcW w:w="1304" w:type="dxa"/>
+                          <w:tcBorders>
+                            <w:top w:val="single" w:sz="18" w:space="0" w:color="auto"/>
+                            <w:left w:val="nil"/>
+                            <w:bottom w:val="nil"/>
+                            <w:right w:val="nil"/>
+                          </w:tcBorders>
+                          <w:vAlign w:val="center"/>
+                        </w:tcPr>
+                        <w:p>
+                          <w:pPr>
+                            <w:pStyle w:val="a"/>
+                            <w:jc w:val="center"/>
+                            <w:rPr>
+                              <w:sz w:val="18"/>
+                            </w:rPr>
+                          </w:pPr>
+                          <w:r>
+                            <w:rPr>
+                              <w:sz w:val="18"/>
+                            </w:rPr>
+                            <w:t>№ докум</w:t>
+                          </w:r>
+                        </w:p>
+                      </w:tc>
+                      <w:tc>
+                        <w:tcPr>
+                          <w:tcW w:w="851" w:type="dxa"/>
+                          <w:tcBorders>
+                            <w:top w:val="single" w:sz="18" w:space="0" w:color="auto"/>
+                            <w:left w:val="single" w:sz="18" w:space="0" w:color="auto"/>
+                            <w:bottom w:val="nil"/>
+                            <w:right w:val="single" w:sz="18" w:space="0" w:color="auto"/>
+                          </w:tcBorders>
+                          <w:vAlign w:val="center"/>
+                        </w:tcPr>
+                        <w:p>
+                          <w:pPr>
+                            <w:pStyle w:val="a"/>
+                            <w:jc w:val="center"/>
+                            <w:rPr>
+                              <w:sz w:val="18"/>
+                            </w:rPr>
+                          </w:pPr>
+                          <w:r>
+                            <w:rPr>
+                              <w:sz w:val="18"/>
+                            </w:rPr>
+                            <w:t>Подпись</w:t>
+                          </w:r>
+                        </w:p>
+                      </w:tc>
+                      <w:tc>
+                        <w:tcPr>
+                          <w:tcW w:w="567" w:type="dxa"/>
+                          <w:tcBorders>
+                            <w:top w:val="single" w:sz="18" w:space="0" w:color="auto"/>
+                            <w:left w:val="nil"/>
+                            <w:bottom w:val="nil"/>
+                            <w:right w:val="single" w:sz="18" w:space="0" w:color="auto"/>
+                          </w:tcBorders>
+                          <w:vAlign w:val="center"/>
+                        </w:tcPr>
+                        <w:p>
+                          <w:pPr>
+                            <w:pStyle w:val="a"/>
+                            <w:jc w:val="center"/>
+                            <w:rPr>
+                              <w:sz w:val="18"/>
+                            </w:rPr>
+                          </w:pPr>
+                          <w:r>
+                            <w:rPr>
+                              <w:sz w:val="18"/>
+                            </w:rPr>
+                            <w:t>Дата</w:t>
+                          </w:r>
+                        </w:p>
+                      </w:tc>
+                      <w:tc>
+                        <w:tcPr>
+                          <w:tcW w:w="6095" w:type="dxa"/>
+                          <w:vMerge/>
+                          <w:tcBorders>
+                            <w:top w:val="single" w:sz="18" w:space="0" w:color="auto"/>
+                            <w:left w:val="nil"/>
+                            <w:bottom w:val="nil"/>
+                            <w:right w:val="single" w:sz="18" w:space="0" w:color="auto"/>
+                          </w:tcBorders>
+                          <w:vAlign w:val="center"/>
+                        </w:tcPr>
+                        <w:p>
+                          <w:pPr>
+                            <w:pStyle w:val="a"/>
+                            <w:rPr>
+                              <w:sz w:val="18"/>
+                            </w:rPr>
+                          </w:pPr>
+                        </w:p>
+                      </w:tc>
+                      <w:tc>
+                        <w:tcPr>
+                          <w:tcW w:w="567" w:type="dxa"/>
+                          <w:vMerge/>
+                          <w:tcBorders>
+                            <w:top w:val="single" w:sz="18" w:space="0" w:color="auto"/>
+                            <w:left w:val="nil"/>
+                            <w:bottom w:val="single" w:sz="18" w:space="0" w:color="auto"/>
+                            <w:right w:val="nil"/>
+                          </w:tcBorders>
+                          <w:vAlign w:val="center"/>
+                        </w:tcPr>
+                        <w:p>
+                          <w:pPr>
+                            <w:pStyle w:val="a"/>
+                            <w:rPr>
+                              <w:sz w:val="18"/>
+                            </w:rPr>
+                          </w:pPr>
+                        </w:p>
+                      </w:tc>
+                    </w:tr>
+                  </w:tbl>
+                  <w:p/>
+                </w:txbxContent>
+              </v:textbox>
+            </v:shape>
+            <w10:wrap anchorx="page" anchory="page"/>
+            <w10:anchorlock/>
+          </v:group>
+        </w:pict>
+      </w:r>
+      <w:r>
+        <w:rPr>
+          <w:sz w:val="28"/>
+          <w:lang w:val="en-US"/>
+        </w:rPr>
+        <w:t>стр.</w:t>
+      </w:r>
+    </w:p>
+    <w:tbl>
+      <w:tblPr>
+        <w:tblW w:w="0" w:type="auto"/>
+        <w:tblLook w:val="04A0" w:firstRow="1" w:lastRow="0" w:firstColumn="1" w:lastColumn="0" w:noHBand="0" w:noVBand="1"/>
+      </w:tblPr>
+      <w:tblGrid>
+        <w:gridCol w:w="9464"/>
+        <w:gridCol w:w="634"/>
+      </w:tblGrid>
+      <w:tr>
+        <w:tc>
+          <w:tcPr>
+            <w:tcW w:w="9464" w:type="dxa"/>
+          </w:tcPr>
+          <w:p>
+            <w:pPr>
+              <w:ind w:right="-2"/>
+              <w:jc w:val="both"/>
+              <w:rPr>
+                <w:sz w:val="28"/>
+                <w:szCs w:val="28"/>
+              </w:rPr>
+            </w:pPr>
+            <w:r>
+              <w:rPr>
+                <w:sz w:val="28"/>
+                <w:szCs w:val="28"/>
+              </w:rPr>
+              <w:t>Приложение Б – Входные данные</w:t>
+            </w:r>
+          </w:p>
+        </w:tc>
+        <w:tc>
+          <w:tcPr>
+            <w:tcW w:w="634" w:type="dxa"/>
+          </w:tcPr>
+          <w:p>
+            <w:pPr>
+              <w:ind w:right="-2"/>
+              <w:jc w:val="right"/>
+              <w:rPr>
+                <w:sz w:val="28"/>
+              </w:rPr>
+            </w:pPr>
+            <w:r>
+              <w:rPr>
+                <w:sz w:val="28"/>
+              </w:rPr>
+              <w:t>1</w:t>
+            </w:r>
+            <w:r>
+              <w:rPr>
+                <w:sz w:val="28"/>
+              </w:rPr>
+              <w:t>14</w:t>
+            </w:r>
+          </w:p>
+        </w:tc>
+      </w:tr>
+      <w:tr>
+        <w:tc>
+          <w:tcPr>
+            <w:tcW w:w="9464" w:type="dxa"/>
+          </w:tcPr>
+          <w:p>
+            <w:pPr>
+              <w:ind w:right="-2"/>
+              <w:jc w:val="both"/>
+              <w:rPr>
+                <w:sz w:val="28"/>
+                <w:szCs w:val="28"/>
+              </w:rPr>
+            </w:pPr>
+            <w:r>
+              <w:rPr>
+                <w:sz w:val="28"/>
+                <w:szCs w:val="28"/>
+              </w:rPr>
+              <w:t>Приложение В – Выходные данные</w:t>
+            </w:r>
+          </w:p>
+        </w:tc>
+        <w:tc>
+          <w:tcPr>
+            <w:tcW w:w="634" w:type="dxa"/>
+          </w:tcPr>
+          <w:p>
+            <w:pPr>
+              <w:ind w:right="-2"/>
+              <w:jc w:val="right"/>
+              <w:rPr>
+                <w:sz w:val="28"/>
+              </w:rPr>
+            </w:pPr>
+            <w:r>
+              <w:rPr>
+                <w:sz w:val="28"/>
+              </w:rPr>
+              <w:t>1</w:t>
+            </w:r>
+            <w:r>
+              <w:rPr>
+                <w:sz w:val="28"/>
+              </w:rPr>
+              <w:t>19</w:t>
+            </w:r>
+          </w:p>
+        </w:tc>
+      </w:tr>
+      <w:tr>
+        <w:tc>
+          <w:tcPr>
+            <w:tcW w:w="9464" w:type="dxa"/>
+          </w:tcPr>
+          <w:p>
+            <w:pPr>
+              <w:ind w:right="-2"/>
+              <w:jc w:val="both"/>
+              <w:rPr>
+                <w:sz w:val="28"/>
+                <w:szCs w:val="28"/>
+              </w:rPr>
+            </w:pPr>
+            <w:r>
+              <w:rPr>
+                <w:sz w:val="28"/>
+                <w:szCs w:val="28"/>
+              </w:rPr>
+              <w:t>Приложение Г – Схема работы комплекса</w:t>
+            </w:r>
+          </w:p>
+        </w:tc>
+        <w:tc>
+          <w:tcPr>
+            <w:tcW w:w="634" w:type="dxa"/>
+          </w:tcPr>
+          <w:p>
+            <w:pPr>
+              <w:ind w:right="-2"/>
+              <w:jc w:val="right"/>
+              <w:rPr>
+                <w:sz w:val="28"/>
+              </w:rPr>
+            </w:pPr>
+            <w:r>
+              <w:rPr>
+                <w:sz w:val="28"/>
+              </w:rPr>
+              <w:t>1</w:t>
+            </w:r>
+            <w:r>
+              <w:rPr>
+                <w:sz w:val="28"/>
+              </w:rPr>
+              <w:t>21</w:t>
+            </w:r>
+          </w:p>
+        </w:tc>
+      </w:tr>
+      <w:tr>
+        <w:tc>
+          <w:tcPr>
+            <w:tcW w:w="9464" w:type="dxa"/>
+          </w:tcPr>
+          <w:p>
+            <w:pPr>
+              <w:rPr>
+                <w:sz w:val="28"/>
+                <w:szCs w:val="28"/>
+              </w:rPr>
+            </w:pPr>
+            <w:r>
+              <w:rPr>
+                <w:bCs/>
+                <w:sz w:val="28"/>
+                <w:szCs w:val="28"/>
+                <w:lang w:val="kk-KZ"/>
+              </w:rPr>
+              <w:t xml:space="preserve">Приложение Д </w:t>
+            </w:r>
+            <w:r>
+              <w:rPr>
+                <w:bCs/>
+                <w:sz w:val="28"/>
+                <w:szCs w:val="28"/>
+              </w:rPr>
+              <w:t xml:space="preserve">- </w:t>
+            </w:r>
+            <w:r>
+              <w:rPr>
+                <w:bCs/>
+                <w:sz w:val="28"/>
+                <w:szCs w:val="28"/>
+              </w:rPr>
+              <w:t xml:space="preserve">Схема </w:t>
+            </w:r>
+            <w:r>
+              <w:rPr>
+                <w:bCs/>
+                <w:sz w:val="28"/>
+                <w:szCs w:val="28"/>
+                <w:lang w:val="kk-KZ"/>
+              </w:rPr>
+              <w:t>взаимодействия таблиц базы данных</w:t>
+            </w:r>
+          </w:p>
+        </w:tc>
+        <w:tc>
+          <w:tcPr>
+            <w:tcW w:w="634" w:type="dxa"/>
+          </w:tcPr>
+          <w:p>
+            <w:pPr>
+              <w:ind w:right="-2"/>
+              <w:jc w:val="right"/>
+              <w:rPr>
+                <w:sz w:val="28"/>
+              </w:rPr>
+            </w:pPr>
+            <w:r>
+              <w:rPr>
+                <w:sz w:val="28"/>
+              </w:rPr>
+              <w:t>1</w:t>
+            </w:r>
+            <w:r>
+              <w:rPr>
+                <w:sz w:val="28"/>
+              </w:rPr>
+              <w:t>22</w:t>
+            </w:r>
+          </w:p>
+        </w:tc>
+      </w:tr>
+      <w:tr>
+        <w:tc>
+          <w:tcPr>
+            <w:tcW w:w="9464" w:type="dxa"/>
+          </w:tcPr>
+          <w:p>
+            <w:pPr>
+              <w:ind w:right="-2"/>
+              <w:jc w:val="both"/>
+              <w:rPr>
+                <w:sz w:val="28"/>
+                <w:szCs w:val="28"/>
+              </w:rPr>
+            </w:pPr>
+            <w:r>
+              <w:rPr>
+                <w:sz w:val="28"/>
+                <w:szCs w:val="28"/>
+              </w:rPr>
+              <w:t xml:space="preserve">Приложение З – </w:t>
+            </w:r>
+            <w:r>
+              <w:rPr>
+                <w:bCs/>
+                <w:sz w:val="28"/>
+                <w:szCs w:val="28"/>
+              </w:rPr>
+              <w:t>Схема алгоритма проблемной программы №1</w:t>
+            </w:r>
+          </w:p>
+        </w:tc>
+        <w:tc>
+          <w:tcPr>
+            <w:tcW w:w="634" w:type="dxa"/>
+          </w:tcPr>
+          <w:p>
+            <w:pPr>
+              <w:ind w:right="-2"/>
+              <w:jc w:val="right"/>
+              <w:rPr>
+                <w:sz w:val="28"/>
+              </w:rPr>
+            </w:pPr>
+            <w:r>
+              <w:rPr>
+                <w:sz w:val="28"/>
+              </w:rPr>
+              <w:t>1</w:t>
+            </w:r>
+            <w:r>
+              <w:rPr>
+                <w:sz w:val="28"/>
+              </w:rPr>
+              <w:t>23</w:t>
+            </w:r>
+          </w:p>
+        </w:tc>
+      </w:tr>
+      <w:tr>
+        <w:tc>
+          <w:tcPr>
+            <w:tcW w:w="9464" w:type="dxa"/>
+          </w:tcPr>
+          <w:p>
+            <w:pPr>
+              <w:ind w:right="-2"/>
+              <w:jc w:val="both"/>
+              <w:rPr>
+                <w:sz w:val="28"/>
+                <w:szCs w:val="28"/>
+              </w:rPr>
+            </w:pPr>
+            <w:r>
+              <w:rPr>
+                <w:sz w:val="28"/>
+                <w:szCs w:val="28"/>
+              </w:rPr>
+              <w:t xml:space="preserve">Приложение И – </w:t>
+            </w:r>
+            <w:r>
+              <w:rPr>
+                <w:bCs/>
+                <w:sz w:val="28"/>
+                <w:szCs w:val="28"/>
+              </w:rPr>
+              <w:t>Схема алгоритма проблемной программы №2</w:t>
+            </w:r>
+          </w:p>
+        </w:tc>
+        <w:tc>
+          <w:tcPr>
+            <w:tcW w:w="634" w:type="dxa"/>
+          </w:tcPr>
+          <w:p>
+            <w:pPr>
+              <w:ind w:right="-2"/>
+              <w:jc w:val="right"/>
+              <w:rPr>
+                <w:sz w:val="28"/>
+              </w:rPr>
+            </w:pPr>
+            <w:r>
+              <w:rPr>
+                <w:sz w:val="28"/>
+              </w:rPr>
+              <w:t>1</w:t>
+            </w:r>
+            <w:r>
+              <w:rPr>
+                <w:sz w:val="28"/>
+              </w:rPr>
+              <w:t>25</w:t>
+            </w:r>
+          </w:p>
+        </w:tc>
+      </w:tr>
+    </w:tbl>
+    <w:p>
+      <w:pPr>
+        <w:ind w:right="-2"/>
+        <w:jc w:val="both"/>
         <w:rPr>
           <w:sz w:val="28"/>
         </w:rPr>
@@ -3798,7 +4634,7 @@
   <w:style w:type="paragraph" w:default="1" w:styleId="Normal">
     <w:name w:val="Normal"/>
     <w:qFormat/>
-    <w:rsid w:val="006644A4"/>
+    <w:rsid w:val="00AD4085"/>
   </w:style>
   <w:style w:type="paragraph" w:styleId="Heading1">
     <w:name w:val="heading 1"/>

</xml_diff>